<commit_message>
Shorten by removing an old bullet. Term consistency.
</commit_message>
<xml_diff>
--- a/resume/MarkGentry_resume.docx
+++ b/resume/MarkGentry_resume.docx
@@ -234,7 +234,20 @@
             </w:pPr>
             <w:commentRangeStart w:id="12"/>
             <w:r>
-              <w:t xml:space="preserve">Extensive software design experience working on wide range of products. Ability to lead with six years engineering management experience while remaining hands-on in product development.  </w:t>
+              <w:t xml:space="preserve">Extensive </w:t>
+            </w:r>
+            <w:del w:id="13" w:author="Gentry, Mark" w:date="2024-08-24T13:00:00Z" w16du:dateUtc="2024-08-24T17:00:00Z">
+              <w:r>
+                <w:delText>software</w:delText>
+              </w:r>
+            </w:del>
+            <w:ins w:id="14" w:author="Gentry, Mark" w:date="2024-08-24T13:00:00Z" w16du:dateUtc="2024-08-24T17:00:00Z">
+              <w:r>
+                <w:t>SW</w:t>
+              </w:r>
+            </w:ins>
+            <w:r>
+              <w:t xml:space="preserve"> design experience working on wide range of products. Ability to lead with six years engineering management experience while remaining hands-on in product development.  </w:t>
             </w:r>
             <w:r>
               <w:t xml:space="preserve">Solid foundation in cryptography. </w:t>
@@ -249,20 +262,15 @@
             <w:pPr>
               <w:pStyle w:val="ResumeBullet"/>
               <w:rPr>
-                <w:del w:id="13" w:author="Gentry, Mark" w:date="2024-08-18T13:25:00Z" w16du:dateUtc="2024-08-18T17:25:00Z"/>
-              </w:rPr>
-              <w:pPrChange w:id="14" w:author="Gentry, Mark" w:date="2024-08-18T13:25:00Z" w16du:dateUtc="2024-08-18T17:25:00Z">
-                <w:pPr>
-                  <w:pStyle w:val="ResumeBullet"/>
-                </w:pPr>
-              </w:pPrChange>
-            </w:pPr>
-            <w:ins w:id="15" w:author="Gentry, Mark" w:date="2024-08-18T13:23:00Z" w16du:dateUtc="2024-08-18T17:23:00Z">
+                <w:del w:id="15" w:author="Gentry, Mark" w:date="2024-08-18T13:25:00Z" w16du:dateUtc="2024-08-18T17:25:00Z"/>
+              </w:rPr>
+            </w:pPr>
+            <w:ins w:id="16" w:author="Gentry, Mark" w:date="2024-08-18T13:23:00Z" w16du:dateUtc="2024-08-18T17:23:00Z">
               <w:r>
                 <w:t>Skills</w:t>
               </w:r>
             </w:ins>
-            <w:del w:id="16" w:author="Gentry, Mark" w:date="2024-08-18T13:23:00Z" w16du:dateUtc="2024-08-18T17:23:00Z">
+            <w:del w:id="17" w:author="Gentry, Mark" w:date="2024-08-18T13:23:00Z" w16du:dateUtc="2024-08-18T17:23:00Z">
               <w:r>
                 <w:delText>SW</w:delText>
               </w:r>
@@ -273,7 +281,7 @@
             <w:r>
               <w:t xml:space="preserve">C, C++, </w:t>
             </w:r>
-            <w:ins w:id="17" w:author="Gentry, Mark" w:date="2024-08-18T13:24:00Z" w16du:dateUtc="2024-08-18T17:24:00Z">
+            <w:ins w:id="18" w:author="Gentry, Mark" w:date="2024-08-18T13:24:00Z" w16du:dateUtc="2024-08-18T17:24:00Z">
               <w:r>
                 <w:t xml:space="preserve">cryptography, </w:t>
               </w:r>
@@ -293,12 +301,12 @@
             <w:r>
               <w:t>PowerShell</w:t>
             </w:r>
-            <w:ins w:id="18" w:author="Gentry, Mark" w:date="2024-08-18T13:25:00Z" w16du:dateUtc="2024-08-18T17:25:00Z">
+            <w:ins w:id="19" w:author="Gentry, Mark" w:date="2024-08-18T13:25:00Z" w16du:dateUtc="2024-08-18T17:25:00Z">
               <w:r>
                 <w:t xml:space="preserve">, </w:t>
               </w:r>
             </w:ins>
-            <w:del w:id="19" w:author="Gentry, Mark" w:date="2024-08-18T13:25:00Z" w16du:dateUtc="2024-08-18T17:25:00Z">
+            <w:del w:id="20" w:author="Gentry, Mark" w:date="2024-08-18T13:25:00Z" w16du:dateUtc="2024-08-18T17:25:00Z">
               <w:r>
                 <w:delText xml:space="preserve"> programming</w:delText>
               </w:r>
@@ -314,7 +322,7 @@
             <w:pPr>
               <w:pStyle w:val="ResumeBullet"/>
             </w:pPr>
-            <w:del w:id="20" w:author="Gentry, Mark" w:date="2024-08-18T13:25:00Z" w16du:dateUtc="2024-08-18T17:25:00Z">
+            <w:del w:id="21" w:author="Gentry, Mark" w:date="2024-08-18T13:25:00Z" w16du:dateUtc="2024-08-18T17:25:00Z">
               <w:r>
                 <w:delText xml:space="preserve">HW/architecture: multi-package/thread </w:delText>
               </w:r>
@@ -553,8 +561,8 @@
             <w:pPr>
               <w:pStyle w:val="ResumeBullet"/>
             </w:pPr>
-            <w:bookmarkStart w:id="21" w:name="intelSummary"/>
-            <w:bookmarkEnd w:id="21"/>
+            <w:bookmarkStart w:id="22" w:name="intelSummary"/>
+            <w:bookmarkEnd w:id="22"/>
           </w:p>
         </w:tc>
       </w:tr>
@@ -575,7 +583,7 @@
                 <w:sz w:val="22"/>
               </w:rPr>
             </w:pPr>
-            <w:commentRangeStart w:id="22"/>
+            <w:commentRangeStart w:id="23"/>
             <w:r>
               <w:rPr>
                 <w:rFonts w:ascii="Times New Roman" w:hAnsi="Times New Roman"/>
@@ -623,7 +631,7 @@
                 <w:sz w:val="22"/>
               </w:rPr>
             </w:pPr>
-            <w:commentRangeStart w:id="23"/>
+            <w:commentRangeStart w:id="24"/>
             <w:r>
               <w:rPr>
                 <w:rFonts w:ascii="Times New Roman" w:hAnsi="Times New Roman"/>
@@ -648,6 +656,13 @@
               </w:rPr>
               <w:t>Architecture</w:t>
             </w:r>
+            <w:commentRangeEnd w:id="24"/>
+            <w:r>
+              <w:rPr>
+                <w:rStyle w:val="CommentReference"/>
+              </w:rPr>
+              <w:commentReference w:id="24"/>
+            </w:r>
             <w:commentRangeEnd w:id="23"/>
             <w:r>
               <w:rPr>
@@ -655,13 +670,6 @@
               </w:rPr>
               <w:commentReference w:id="23"/>
             </w:r>
-            <w:commentRangeEnd w:id="22"/>
-            <w:r>
-              <w:rPr>
-                <w:rStyle w:val="CommentReference"/>
-              </w:rPr>
-              <w:commentReference w:id="22"/>
-            </w:r>
             <w:r>
               <w:rPr>
                 <w:rFonts w:ascii="Times New Roman" w:hAnsi="Times New Roman"/>
@@ -670,7 +678,7 @@
               </w:rPr>
               <w:t>/</w:t>
             </w:r>
-            <w:del w:id="24" w:author="Gentry, Mark" w:date="2024-08-21T08:25:00Z" w16du:dateUtc="2024-08-21T12:25:00Z">
+            <w:del w:id="25" w:author="Gentry, Mark" w:date="2024-08-21T08:25:00Z" w16du:dateUtc="2024-08-21T12:25:00Z">
               <w:r>
                 <w:rPr>
                   <w:rFonts w:ascii="Times New Roman" w:hAnsi="Times New Roman"/>
@@ -708,7 +716,7 @@
                 <w:sz w:val="22"/>
               </w:rPr>
             </w:pPr>
-            <w:del w:id="25" w:author="Gentry, Mark" w:date="2024-08-18T10:55:00Z" w16du:dateUtc="2024-08-18T14:55:00Z">
+            <w:del w:id="26" w:author="Gentry, Mark" w:date="2024-08-18T10:55:00Z" w16du:dateUtc="2024-08-18T14:55:00Z">
               <w:r>
                 <w:rPr>
                   <w:rFonts w:ascii="Times New Roman" w:hAnsi="Times New Roman"/>
@@ -766,27 +774,17 @@
               <w:rPr>
                 <w:b/>
                 <w:bCs/>
-                <w:rPrChange w:id="26" w:author="Gentry, Mark" w:date="2024-08-18T12:49:00Z" w16du:dateUtc="2024-08-18T16:49:00Z">
+                <w:rPrChange w:id="27" w:author="Gentry, Mark" w:date="2024-08-18T12:49:00Z" w16du:dateUtc="2024-08-18T16:49:00Z">
                   <w:rPr/>
                 </w:rPrChange>
               </w:rPr>
-              <w:pPrChange w:id="27" w:author="Gentry, Mark" w:date="2024-08-18T13:04:00Z" w16du:dateUtc="2024-08-18T17:04:00Z">
+              <w:pPrChange w:id="28" w:author="Gentry, Mark" w:date="2024-08-18T13:04:00Z" w16du:dateUtc="2024-08-18T17:04:00Z">
                 <w:pPr>
                   <w:pStyle w:val="ResumeBullet"/>
                 </w:pPr>
               </w:pPrChange>
             </w:pPr>
-            <w:ins w:id="28" w:author="Gentry, Mark" w:date="2024-08-18T12:49:00Z" w16du:dateUtc="2024-08-18T16:49:00Z">
-              <w:r>
-                <w:rPr>
-                  <w:b/>
-                  <w:bCs/>
-                  <w:rPrChange w:id="29" w:author="Gentry, Mark" w:date="2024-08-18T12:49:00Z" w16du:dateUtc="2024-08-18T16:49:00Z">
-                    <w:rPr/>
-                  </w:rPrChange>
-                </w:rPr>
-                <w:sym w:font="Symbol" w:char="F0B7"/>
-              </w:r>
+            <w:ins w:id="29" w:author="Gentry, Mark" w:date="2024-08-18T12:49:00Z" w16du:dateUtc="2024-08-18T16:49:00Z">
               <w:r>
                 <w:rPr>
                   <w:b/>
@@ -795,20 +793,19 @@
                     <w:rPr/>
                   </w:rPrChange>
                 </w:rPr>
+                <w:sym w:font="Symbol" w:char="F0B7"/>
+              </w:r>
+              <w:r>
+                <w:rPr>
+                  <w:b/>
+                  <w:bCs/>
+                  <w:rPrChange w:id="31" w:author="Gentry, Mark" w:date="2024-08-18T12:49:00Z" w16du:dateUtc="2024-08-18T16:49:00Z">
+                    <w:rPr/>
+                  </w:rPrChange>
+                </w:rPr>
                 <w:t xml:space="preserve">  </w:t>
               </w:r>
             </w:ins>
-            <w:r>
-              <w:rPr>
-                <w:b/>
-                <w:bCs/>
-                <w:rPrChange w:id="31" w:author="Gentry, Mark" w:date="2024-08-18T12:49:00Z" w16du:dateUtc="2024-08-18T16:49:00Z">
-                  <w:rPr/>
-                </w:rPrChange>
-              </w:rPr>
-              <w:t xml:space="preserve">Led SGX SW response to </w:t>
-            </w:r>
-            <w:proofErr w:type="spellStart"/>
             <w:r>
               <w:rPr>
                 <w:b/>
@@ -817,9 +814,9 @@
                   <w:rPr/>
                 </w:rPrChange>
               </w:rPr>
-              <w:t>Spectre</w:t>
-            </w:r>
-            <w:proofErr w:type="spellEnd"/>
+              <w:t xml:space="preserve">Led SGX SW response to </w:t>
+            </w:r>
+            <w:proofErr w:type="spellStart"/>
             <w:r>
               <w:rPr>
                 <w:b/>
@@ -828,8 +825,9 @@
                   <w:rPr/>
                 </w:rPrChange>
               </w:rPr>
-              <w:t xml:space="preserve"> and subsequently discovered microarchitectural/transient execution issues</w:t>
-            </w:r>
+              <w:t>Spectre</w:t>
+            </w:r>
+            <w:proofErr w:type="spellEnd"/>
             <w:r>
               <w:rPr>
                 <w:b/>
@@ -838,9 +836,8 @@
                   <w:rPr/>
                 </w:rPrChange>
               </w:rPr>
-              <w:t xml:space="preserve">. Led mitigation efforts when mitigations were implemented in SW, for example, for </w:t>
-            </w:r>
-            <w:proofErr w:type="spellStart"/>
+              <w:t xml:space="preserve"> and subsequently discovered microarchitectural/transient execution issues</w:t>
+            </w:r>
             <w:r>
               <w:rPr>
                 <w:b/>
@@ -849,9 +846,9 @@
                   <w:rPr/>
                 </w:rPrChange>
               </w:rPr>
-              <w:t>Spectre</w:t>
-            </w:r>
-            <w:proofErr w:type="spellEnd"/>
+              <w:t xml:space="preserve">. Led mitigation efforts when mitigations were implemented in SW, for example, for </w:t>
+            </w:r>
+            <w:proofErr w:type="spellStart"/>
             <w:r>
               <w:rPr>
                 <w:b/>
@@ -860,19 +857,20 @@
                   <w:rPr/>
                 </w:rPrChange>
               </w:rPr>
+              <w:t>Spectre</w:t>
+            </w:r>
+            <w:proofErr w:type="spellEnd"/>
+            <w:r>
+              <w:rPr>
+                <w:b/>
+                <w:bCs/>
+                <w:rPrChange w:id="37" w:author="Gentry, Mark" w:date="2024-08-18T12:49:00Z" w16du:dateUtc="2024-08-18T16:49:00Z">
+                  <w:rPr/>
+                </w:rPrChange>
+              </w:rPr>
               <w:t xml:space="preserve"> variant 1 and </w:t>
             </w:r>
-            <w:ins w:id="37" w:author="Gentry, Mark" w:date="2024-08-16T15:01:00Z" w16du:dateUtc="2024-08-16T19:01:00Z">
-              <w:r>
-                <w:rPr>
-                  <w:b/>
-                  <w:bCs/>
-                  <w:rPrChange w:id="38" w:author="Gentry, Mark" w:date="2024-08-18T12:49:00Z" w16du:dateUtc="2024-08-18T16:49:00Z">
-                    <w:rPr/>
-                  </w:rPrChange>
-                </w:rPr>
-                <w:fldChar w:fldCharType="begin"/>
-              </w:r>
+            <w:ins w:id="38" w:author="Gentry, Mark" w:date="2024-08-16T15:01:00Z" w16du:dateUtc="2024-08-16T19:01:00Z">
               <w:r>
                 <w:rPr>
                   <w:b/>
@@ -881,7 +879,7 @@
                     <w:rPr/>
                   </w:rPrChange>
                 </w:rPr>
-                <w:instrText>HYPERLINK "https://lviattack.eu/"</w:instrText>
+                <w:fldChar w:fldCharType="begin"/>
               </w:r>
               <w:r>
                 <w:rPr>
@@ -890,6 +888,13 @@
                   <w:rPrChange w:id="40" w:author="Gentry, Mark" w:date="2024-08-18T12:49:00Z" w16du:dateUtc="2024-08-18T16:49:00Z">
                     <w:rPr/>
                   </w:rPrChange>
+                </w:rPr>
+                <w:instrText>HYPERLINK "https://lviattack.eu/"</w:instrText>
+              </w:r>
+              <w:r>
+                <w:rPr>
+                  <w:b/>
+                  <w:bCs/>
                 </w:rPr>
               </w:r>
               <w:r>
@@ -1121,7 +1126,7 @@
       <w:tr>
         <w:trPr>
           <w:cantSplit/>
-          <w:del w:id="67" w:author="Gentry, Mark" w:date="2024-08-16T22:49:00Z" w16du:dateUtc="2024-08-17T02:49:00Z"/>
+          <w:del w:id="67" w:author="Gentry, Mark" w:date="2024-08-16T22:49:00Z"/>
         </w:trPr>
         <w:tc>
           <w:tcPr>
@@ -1257,7 +1262,7 @@
       <w:tr>
         <w:trPr>
           <w:cantSplit/>
-          <w:ins w:id="74" w:author="Gentry, Mark" w:date="2024-08-18T11:03:00Z" w16du:dateUtc="2024-08-18T15:03:00Z"/>
+          <w:ins w:id="74" w:author="Gentry, Mark" w:date="2024-08-18T11:03:00Z"/>
         </w:trPr>
         <w:tc>
           <w:tcPr>
@@ -1465,14 +1470,12 @@
               <w:r>
                 <w:fldChar w:fldCharType="separate"/>
               </w:r>
-              <w:proofErr w:type="spellStart"/>
               <w:r>
                 <w:rPr>
                   <w:rStyle w:val="Hyperlink"/>
                 </w:rPr>
                 <w:t>SGX.Fail</w:t>
               </w:r>
-              <w:proofErr w:type="spellEnd"/>
               <w:r>
                 <w:fldChar w:fldCharType="end"/>
               </w:r>
@@ -1953,15 +1956,7 @@
                   <w:b/>
                   <w:sz w:val="22"/>
                 </w:rPr>
-                <w:t>SW</w:t>
-              </w:r>
-              <w:r>
-                <w:rPr>
-                  <w:rFonts w:ascii="Times New Roman" w:hAnsi="Times New Roman"/>
-                  <w:b/>
-                  <w:sz w:val="22"/>
-                </w:rPr>
-                <w:t xml:space="preserve"> </w:t>
+                <w:t xml:space="preserve">SW </w:t>
               </w:r>
             </w:ins>
             <w:r>
@@ -2687,6 +2682,7 @@
       <w:tr>
         <w:trPr>
           <w:cantSplit/>
+          <w:del w:id="163" w:author="Gentry, Mark" w:date="2024-08-24T12:57:00Z" w16du:dateUtc="2024-08-24T16:57:00Z"/>
         </w:trPr>
         <w:tc>
           <w:tcPr>
@@ -2695,6 +2691,7 @@
           <w:p>
             <w:pPr>
               <w:rPr>
+                <w:del w:id="164" w:author="Gentry, Mark" w:date="2024-08-24T12:57:00Z" w16du:dateUtc="2024-08-24T16:57:00Z"/>
                 <w:rFonts w:ascii="Times New Roman" w:hAnsi="Times New Roman"/>
                 <w:b/>
                 <w:sz w:val="22"/>
@@ -2710,21 +2707,26 @@
           <w:p>
             <w:pPr>
               <w:pStyle w:val="ResumeBullet"/>
-            </w:pPr>
-            <w:bookmarkStart w:id="163" w:name="intelSenior"/>
-            <w:bookmarkEnd w:id="163"/>
-            <w:r>
-              <w:sym w:font="Symbol" w:char="F0B7"/>
-            </w:r>
-            <w:r>
-              <w:t xml:space="preserve">  Implemented NetBIOS server prototype for </w:t>
-            </w:r>
-            <w:r>
-              <w:t xml:space="preserve">Wake-on-Event </w:t>
-            </w:r>
-            <w:r>
-              <w:t>project.</w:t>
-            </w:r>
+              <w:rPr>
+                <w:del w:id="165" w:author="Gentry, Mark" w:date="2024-08-24T12:57:00Z" w16du:dateUtc="2024-08-24T16:57:00Z"/>
+              </w:rPr>
+            </w:pPr>
+            <w:bookmarkStart w:id="166" w:name="intelSenior"/>
+            <w:bookmarkEnd w:id="166"/>
+            <w:del w:id="167" w:author="Gentry, Mark" w:date="2024-08-24T12:57:00Z" w16du:dateUtc="2024-08-24T16:57:00Z">
+              <w:r>
+                <w:sym w:font="Symbol" w:char="F0B7"/>
+              </w:r>
+              <w:r>
+                <w:delText xml:space="preserve">  Implemented NetBIOS server prototype for </w:delText>
+              </w:r>
+              <w:r>
+                <w:delText xml:space="preserve">Wake-on-Event </w:delText>
+              </w:r>
+              <w:r>
+                <w:delText>project.</w:delText>
+              </w:r>
+            </w:del>
           </w:p>
         </w:tc>
       </w:tr>
@@ -3062,7 +3064,7 @@
             <w:r>
               <w:t xml:space="preserve">  Led HD Audio soft modem project.  Communicated significance of project to organization – laptops to quickly transition to these modems after their introduction</w:t>
             </w:r>
-            <w:del w:id="164" w:author="Gentry, Mark" w:date="2024-08-16T21:35:00Z" w16du:dateUtc="2024-08-17T01:35:00Z">
+            <w:del w:id="168" w:author="Gentry, Mark" w:date="2024-08-16T21:35:00Z" w16du:dateUtc="2024-08-17T01:35:00Z">
               <w:r>
                 <w:delText>.  Port AC’97 soft modem to HD Audio</w:delText>
               </w:r>
@@ -3106,12 +3108,12 @@
             <w:r>
               <w:t xml:space="preserve">  Identified and helped resolve issues in HD Audio bus driver.  Brought up HD Audio modem codec, found workarounds for codec bugs, and helped integrate workarounds in bus </w:t>
             </w:r>
-            <w:del w:id="165" w:author="Gentry, Mark" w:date="2024-08-14T08:30:00Z" w16du:dateUtc="2024-08-14T12:30:00Z">
+            <w:del w:id="169" w:author="Gentry, Mark" w:date="2024-08-14T08:30:00Z" w16du:dateUtc="2024-08-14T12:30:00Z">
               <w:r>
                 <w:delText>or</w:delText>
               </w:r>
             </w:del>
-            <w:ins w:id="166" w:author="Gentry, Mark" w:date="2024-08-14T08:30:00Z" w16du:dateUtc="2024-08-14T12:30:00Z">
+            <w:ins w:id="170" w:author="Gentry, Mark" w:date="2024-08-14T08:30:00Z" w16du:dateUtc="2024-08-14T12:30:00Z">
               <w:r>
                 <w:t>and</w:t>
               </w:r>
@@ -3119,7 +3121,7 @@
             <w:r>
               <w:t xml:space="preserve"> modem driver</w:t>
             </w:r>
-            <w:ins w:id="167" w:author="Gentry, Mark" w:date="2024-08-14T08:30:00Z" w16du:dateUtc="2024-08-14T12:30:00Z">
+            <w:ins w:id="171" w:author="Gentry, Mark" w:date="2024-08-14T08:30:00Z" w16du:dateUtc="2024-08-14T12:30:00Z">
               <w:r>
                 <w:t>s</w:t>
               </w:r>
@@ -3163,12 +3165,12 @@
             <w:r>
               <w:t xml:space="preserve">  Responsible for getting modem included in Intel’s Mobile Products Group (MPG) reference motherboard kits</w:t>
             </w:r>
-            <w:del w:id="168" w:author="Gentry, Mark" w:date="2024-08-14T08:31:00Z" w16du:dateUtc="2024-08-14T12:31:00Z">
+            <w:del w:id="172" w:author="Gentry, Mark" w:date="2024-08-14T08:31:00Z" w16du:dateUtc="2024-08-14T12:31:00Z">
               <w:r>
                 <w:delText xml:space="preserve"> and for defining process for this</w:delText>
               </w:r>
             </w:del>
-            <w:del w:id="169" w:author="Gentry, Mark" w:date="2024-08-16T21:36:00Z" w16du:dateUtc="2024-08-17T01:36:00Z">
+            <w:del w:id="173" w:author="Gentry, Mark" w:date="2024-08-16T21:36:00Z" w16du:dateUtc="2024-08-17T01:36:00Z">
               <w:r>
                 <w:delText>.  Addressed any issue with kit that affected modem: BIOS bugs, lack of documentation, chipset silicon bugs, etc</w:delText>
               </w:r>
@@ -3182,7 +3184,7 @@
       <w:tr>
         <w:trPr>
           <w:cantSplit/>
-          <w:del w:id="170" w:author="Gentry, Mark" w:date="2024-08-14T08:31:00Z"/>
+          <w:del w:id="174" w:author="Gentry, Mark" w:date="2024-08-14T08:31:00Z"/>
         </w:trPr>
         <w:tc>
           <w:tcPr>
@@ -3191,7 +3193,7 @@
           <w:p>
             <w:pPr>
               <w:rPr>
-                <w:del w:id="171" w:author="Gentry, Mark" w:date="2024-08-14T08:31:00Z" w16du:dateUtc="2024-08-14T12:31:00Z"/>
+                <w:del w:id="175" w:author="Gentry, Mark" w:date="2024-08-14T08:31:00Z" w16du:dateUtc="2024-08-14T12:31:00Z"/>
                 <w:rFonts w:ascii="Times New Roman" w:hAnsi="Times New Roman"/>
                 <w:b/>
                 <w:sz w:val="22"/>
@@ -3208,10 +3210,10 @@
             <w:pPr>
               <w:pStyle w:val="ResumeBullet"/>
               <w:rPr>
-                <w:del w:id="172" w:author="Gentry, Mark" w:date="2024-08-14T08:31:00Z" w16du:dateUtc="2024-08-14T12:31:00Z"/>
-              </w:rPr>
-            </w:pPr>
-            <w:del w:id="173" w:author="Gentry, Mark" w:date="2024-08-14T08:31:00Z" w16du:dateUtc="2024-08-14T12:31:00Z">
+                <w:del w:id="176" w:author="Gentry, Mark" w:date="2024-08-14T08:31:00Z" w16du:dateUtc="2024-08-14T12:31:00Z"/>
+              </w:rPr>
+            </w:pPr>
+            <w:del w:id="177" w:author="Gentry, Mark" w:date="2024-08-14T08:31:00Z" w16du:dateUtc="2024-08-14T12:31:00Z">
               <w:r>
                 <w:sym w:font="Symbol" w:char="F0B7"/>
               </w:r>
@@ -3286,9 +3288,9 @@
               <w:pStyle w:val="MyNormalIndent"/>
               <w:ind w:firstLine="0"/>
             </w:pPr>
-            <w:bookmarkStart w:id="174" w:name="intelManager"/>
-            <w:bookmarkEnd w:id="174"/>
-            <w:ins w:id="175" w:author="Gentry, Mark" w:date="2024-08-14T08:32:00Z" w16du:dateUtc="2024-08-14T12:32:00Z">
+            <w:bookmarkStart w:id="178" w:name="intelManager"/>
+            <w:bookmarkEnd w:id="178"/>
+            <w:ins w:id="179" w:author="Gentry, Mark" w:date="2024-08-14T08:32:00Z" w16du:dateUtc="2024-08-14T12:32:00Z">
               <w:r>
                 <w:sym w:font="Symbol" w:char="F0B7"/>
               </w:r>
@@ -3299,17 +3301,17 @@
             <w:r>
               <w:t>Technical lead on embedded V.92 modem project</w:t>
             </w:r>
-            <w:ins w:id="176" w:author="Gentry, Mark" w:date="2024-08-18T13:32:00Z" w16du:dateUtc="2024-08-18T17:32:00Z">
+            <w:ins w:id="180" w:author="Gentry, Mark" w:date="2024-08-18T13:32:00Z" w16du:dateUtc="2024-08-18T17:32:00Z">
               <w:r>
                 <w:t xml:space="preserve"> </w:t>
               </w:r>
             </w:ins>
-            <w:ins w:id="177" w:author="Gentry, Mark" w:date="2024-08-18T13:33:00Z" w16du:dateUtc="2024-08-18T17:33:00Z">
+            <w:ins w:id="181" w:author="Gentry, Mark" w:date="2024-08-18T13:33:00Z" w16du:dateUtc="2024-08-18T17:33:00Z">
               <w:r>
                 <w:t xml:space="preserve">where the goals were </w:t>
               </w:r>
             </w:ins>
-            <w:del w:id="178" w:author="Gentry, Mark" w:date="2024-08-18T13:07:00Z" w16du:dateUtc="2024-08-18T17:07:00Z">
+            <w:del w:id="182" w:author="Gentry, Mark" w:date="2024-08-18T13:07:00Z" w16du:dateUtc="2024-08-18T17:07:00Z">
               <w:r>
                 <w:delText xml:space="preserve">. </w:delText>
               </w:r>
@@ -3317,12 +3319,12 @@
                 <w:delText xml:space="preserve">This was shortly </w:delText>
               </w:r>
             </w:del>
-            <w:del w:id="179" w:author="Gentry, Mark" w:date="2024-08-18T13:32:00Z" w16du:dateUtc="2024-08-18T17:32:00Z">
+            <w:del w:id="183" w:author="Gentry, Mark" w:date="2024-08-18T13:32:00Z" w16du:dateUtc="2024-08-18T17:32:00Z">
               <w:r>
                 <w:delText xml:space="preserve">after Intel acquired Cirrus Logic modem spinoff, Ambient. The goal </w:delText>
               </w:r>
             </w:del>
-            <w:del w:id="180" w:author="Gentry, Mark" w:date="2024-08-18T13:33:00Z" w16du:dateUtc="2024-08-18T17:33:00Z">
+            <w:del w:id="184" w:author="Gentry, Mark" w:date="2024-08-18T13:33:00Z" w16du:dateUtc="2024-08-18T17:33:00Z">
               <w:r>
                 <w:delText xml:space="preserve">was </w:delText>
               </w:r>
@@ -3406,7 +3408,7 @@
             <w:r>
               <w:t>Responsible for selection of development tools</w:t>
             </w:r>
-            <w:del w:id="181" w:author="Gentry, Mark" w:date="2024-08-16T21:37:00Z" w16du:dateUtc="2024-08-17T01:37:00Z">
+            <w:del w:id="185" w:author="Gentry, Mark" w:date="2024-08-16T21:37:00Z" w16du:dateUtc="2024-08-17T01:37:00Z">
               <w:r>
                 <w:delText xml:space="preserve"> and new build procedure</w:delText>
               </w:r>
@@ -3489,22 +3491,22 @@
             <w:r>
               <w:t xml:space="preserve">  Early reviewer of HD Audio spec, paying close attention to design of modem codecs</w:t>
             </w:r>
-            <w:del w:id="182" w:author="Gentry, Mark" w:date="2024-08-18T13:35:00Z" w16du:dateUtc="2024-08-18T17:35:00Z">
+            <w:del w:id="186" w:author="Gentry, Mark" w:date="2024-08-18T13:35:00Z" w16du:dateUtc="2024-08-18T17:35:00Z">
               <w:r>
                 <w:delText xml:space="preserve">.  Feedback contributed to several changes in </w:delText>
               </w:r>
             </w:del>
-            <w:del w:id="183" w:author="Gentry, Mark" w:date="2024-08-18T13:08:00Z" w16du:dateUtc="2024-08-18T17:08:00Z">
+            <w:del w:id="187" w:author="Gentry, Mark" w:date="2024-08-18T13:08:00Z" w16du:dateUtc="2024-08-18T17:08:00Z">
               <w:r>
                 <w:delText>spec;</w:delText>
               </w:r>
             </w:del>
-            <w:del w:id="184" w:author="Gentry, Mark" w:date="2024-08-18T13:35:00Z" w16du:dateUtc="2024-08-18T17:35:00Z">
+            <w:del w:id="188" w:author="Gentry, Mark" w:date="2024-08-18T13:35:00Z" w16du:dateUtc="2024-08-18T17:35:00Z">
               <w:r>
                 <w:delText xml:space="preserve"> e.g., spec not standardizing modem codecs as it does audio codecs</w:delText>
               </w:r>
             </w:del>
-            <w:del w:id="185" w:author="Gentry, Mark" w:date="2024-08-16T21:37:00Z" w16du:dateUtc="2024-08-17T01:37:00Z">
+            <w:del w:id="189" w:author="Gentry, Mark" w:date="2024-08-16T21:37:00Z" w16du:dateUtc="2024-08-17T01:37:00Z">
               <w:r>
                 <w:delText>.  Identified parts of spec requiring special features in modem codecs</w:delText>
               </w:r>
@@ -3512,7 +3514,7 @@
             <w:r>
               <w:t xml:space="preserve">.  Helped </w:t>
             </w:r>
-            <w:del w:id="186" w:author="Gentry, Mark" w:date="2024-08-14T08:34:00Z" w16du:dateUtc="2024-08-14T12:34:00Z">
+            <w:del w:id="190" w:author="Gentry, Mark" w:date="2024-08-14T08:34:00Z" w16du:dateUtc="2024-08-14T12:34:00Z">
               <w:r>
                 <w:delText xml:space="preserve">key </w:delText>
               </w:r>
@@ -3520,12 +3522,12 @@
             <w:r>
               <w:t>IHVs with design of their HD Audio modem codecs</w:t>
             </w:r>
-            <w:del w:id="187" w:author="Gentry, Mark" w:date="2024-08-18T13:08:00Z" w16du:dateUtc="2024-08-18T17:08:00Z">
+            <w:del w:id="191" w:author="Gentry, Mark" w:date="2024-08-18T13:08:00Z" w16du:dateUtc="2024-08-18T17:08:00Z">
               <w:r>
                 <w:delText>.  Determined changes to AC'97 modem codecs necessary for HD Audio</w:delText>
               </w:r>
             </w:del>
-            <w:del w:id="188" w:author="Gentry, Mark" w:date="2024-08-16T21:38:00Z" w16du:dateUtc="2024-08-17T01:38:00Z">
+            <w:del w:id="192" w:author="Gentry, Mark" w:date="2024-08-16T21:38:00Z" w16du:dateUtc="2024-08-17T01:38:00Z">
               <w:r>
                 <w:delText>.  Work with Intel mobile and desktop groups and Microsoft on how to architect an HD Audio soft modem product</w:delText>
               </w:r>
@@ -3797,7 +3799,7 @@
             <w:r>
               <w:t xml:space="preserve">met chip validation </w:t>
             </w:r>
-            <w:ins w:id="189" w:author="Gentry, Mark" w:date="2024-08-16T21:40:00Z" w16du:dateUtc="2024-08-17T01:40:00Z">
+            <w:ins w:id="193" w:author="Gentry, Mark" w:date="2024-08-16T21:40:00Z" w16du:dateUtc="2024-08-17T01:40:00Z">
               <w:r>
                 <w:t xml:space="preserve">and development </w:t>
               </w:r>
@@ -3805,7 +3807,7 @@
             <w:r>
               <w:t>requirements</w:t>
             </w:r>
-            <w:del w:id="190" w:author="Gentry, Mark" w:date="2024-08-16T21:41:00Z" w16du:dateUtc="2024-08-17T01:41:00Z">
+            <w:del w:id="194" w:author="Gentry, Mark" w:date="2024-08-16T21:41:00Z" w16du:dateUtc="2024-08-17T01:41:00Z">
               <w:r>
                 <w:delText>.  Also made sure boards had features required for software development: two different AFEs, hardware necessary to work with existing debug setups, etc</w:delText>
               </w:r>
@@ -3813,12 +3815,12 @@
             <w:r>
               <w:t xml:space="preserve">.  Drove evaluation board </w:t>
             </w:r>
-            <w:del w:id="191" w:author="Gentry, Mark" w:date="2024-08-16T21:41:00Z" w16du:dateUtc="2024-08-17T01:41:00Z">
+            <w:del w:id="195" w:author="Gentry, Mark" w:date="2024-08-16T21:41:00Z" w16du:dateUtc="2024-08-17T01:41:00Z">
               <w:r>
                 <w:delText xml:space="preserve">layout and fab </w:delText>
               </w:r>
             </w:del>
-            <w:ins w:id="192" w:author="Gentry, Mark" w:date="2024-08-16T21:41:00Z" w16du:dateUtc="2024-08-17T01:41:00Z">
+            <w:ins w:id="196" w:author="Gentry, Mark" w:date="2024-08-16T21:41:00Z" w16du:dateUtc="2024-08-17T01:41:00Z">
               <w:r>
                 <w:t xml:space="preserve">project </w:t>
               </w:r>
@@ -3925,7 +3927,20 @@
               <w:t xml:space="preserve">  </w:t>
             </w:r>
             <w:r>
-              <w:t>Defined API designed to hide hardware-dependent and OS-dependent details.  Wrote corresponding code for both bondouts</w:t>
+              <w:t xml:space="preserve">Defined API designed to hide </w:t>
+            </w:r>
+            <w:del w:id="197" w:author="Gentry, Mark" w:date="2024-08-24T13:01:00Z" w16du:dateUtc="2024-08-24T17:01:00Z">
+              <w:r>
+                <w:delText>hardware</w:delText>
+              </w:r>
+            </w:del>
+            <w:ins w:id="198" w:author="Gentry, Mark" w:date="2024-08-24T13:01:00Z" w16du:dateUtc="2024-08-24T17:01:00Z">
+              <w:r>
+                <w:t>HW</w:t>
+              </w:r>
+            </w:ins>
+            <w:r>
+              <w:t>-dependent and OS-dependent details.  Wrote corresponding code for both bondouts</w:t>
             </w:r>
             <w:r>
               <w:t xml:space="preserve"> (controller-based and controllerless/PCI) of the new modem chip</w:t>
@@ -3972,7 +3987,7 @@
             <w:r>
               <w:t xml:space="preserve">Developed bringup </w:t>
             </w:r>
-            <w:del w:id="193" w:author="Gentry, Mark" w:date="2024-08-16T21:42:00Z" w16du:dateUtc="2024-08-17T01:42:00Z">
+            <w:del w:id="199" w:author="Gentry, Mark" w:date="2024-08-16T21:42:00Z" w16du:dateUtc="2024-08-17T01:42:00Z">
               <w:r>
                 <w:delText>software</w:delText>
               </w:r>
@@ -3980,12 +3995,9 @@
                 <w:delText xml:space="preserve"> </w:delText>
               </w:r>
             </w:del>
-            <w:ins w:id="194" w:author="Gentry, Mark" w:date="2024-08-16T21:42:00Z" w16du:dateUtc="2024-08-17T01:42:00Z">
-              <w:r>
-                <w:t>Windows drivers</w:t>
-              </w:r>
-              <w:r>
-                <w:t xml:space="preserve"> </w:t>
+            <w:ins w:id="200" w:author="Gentry, Mark" w:date="2024-08-16T21:42:00Z" w16du:dateUtc="2024-08-17T01:42:00Z">
+              <w:r>
+                <w:t xml:space="preserve">Windows drivers </w:t>
               </w:r>
             </w:ins>
             <w:r>
@@ -3994,7 +4006,7 @@
             <w:r>
               <w:t>: read/write registers, read/write chip memory, test DMA, timers, and GPIO, and load DSP and controller code</w:t>
             </w:r>
-            <w:del w:id="195" w:author="Gentry, Mark" w:date="2024-08-16T21:42:00Z" w16du:dateUtc="2024-08-17T01:42:00Z">
+            <w:del w:id="201" w:author="Gentry, Mark" w:date="2024-08-16T21:42:00Z" w16du:dateUtc="2024-08-17T01:42:00Z">
               <w:r>
                 <w:delText>.  Ran in Windows 98 and Windows 2000 using VXD and WDM drivers, respectively</w:delText>
               </w:r>
@@ -4184,13 +4196,26 @@
               <w:pStyle w:val="MyNormalIndent"/>
               <w:ind w:firstLine="0"/>
             </w:pPr>
-            <w:bookmarkStart w:id="196" w:name="hughes"/>
-            <w:bookmarkEnd w:id="196"/>
+            <w:bookmarkStart w:id="202" w:name="hughes"/>
+            <w:bookmarkEnd w:id="202"/>
             <w:r>
               <w:sym w:font="Symbol" w:char="F0B7"/>
             </w:r>
             <w:r>
-              <w:t xml:space="preserve">  Responsible for video and audio software development for Hughes's version of the AOLTV </w:t>
+              <w:t xml:space="preserve">  Responsible for video and audio </w:t>
+            </w:r>
+            <w:del w:id="203" w:author="Gentry, Mark" w:date="2024-08-24T13:00:00Z" w16du:dateUtc="2024-08-24T17:00:00Z">
+              <w:r>
+                <w:delText>software</w:delText>
+              </w:r>
+            </w:del>
+            <w:ins w:id="204" w:author="Gentry, Mark" w:date="2024-08-24T13:00:00Z" w16du:dateUtc="2024-08-24T17:00:00Z">
+              <w:r>
+                <w:t>SW</w:t>
+              </w:r>
+            </w:ins>
+            <w:r>
+              <w:t xml:space="preserve"> development for Hughes's version of the AOLTV </w:t>
             </w:r>
             <w:proofErr w:type="spellStart"/>
             <w:r>
@@ -4200,12 +4225,12 @@
             <w:r>
               <w:t xml:space="preserve"> box</w:t>
             </w:r>
-            <w:del w:id="197" w:author="Gentry, Mark" w:date="2024-08-18T13:09:00Z" w16du:dateUtc="2024-08-18T17:09:00Z">
+            <w:del w:id="205" w:author="Gentry, Mark" w:date="2024-08-18T13:09:00Z" w16du:dateUtc="2024-08-18T17:09:00Z">
               <w:r>
                 <w:delText xml:space="preserve">.  The settop box </w:delText>
               </w:r>
             </w:del>
-            <w:ins w:id="198" w:author="Gentry, Mark" w:date="2024-08-18T13:09:00Z" w16du:dateUtc="2024-08-18T17:09:00Z">
+            <w:ins w:id="206" w:author="Gentry, Mark" w:date="2024-08-18T13:09:00Z" w16du:dateUtc="2024-08-18T17:09:00Z">
               <w:r>
                 <w:t xml:space="preserve">, which </w:t>
               </w:r>
@@ -4249,12 +4274,12 @@
             <w:r>
               <w:t xml:space="preserve">  </w:t>
             </w:r>
-            <w:ins w:id="199" w:author="Gentry, Mark" w:date="2024-08-18T13:10:00Z" w16du:dateUtc="2024-08-18T17:10:00Z">
+            <w:ins w:id="207" w:author="Gentry, Mark" w:date="2024-08-18T13:10:00Z" w16du:dateUtc="2024-08-18T17:10:00Z">
               <w:r>
                 <w:t xml:space="preserve">Used </w:t>
               </w:r>
             </w:ins>
-            <w:del w:id="200" w:author="Gentry, Mark" w:date="2024-08-18T13:10:00Z" w16du:dateUtc="2024-08-18T17:10:00Z">
+            <w:del w:id="208" w:author="Gentry, Mark" w:date="2024-08-18T13:10:00Z" w16du:dateUtc="2024-08-18T17:10:00Z">
               <w:r>
                 <w:delText>Platform use</w:delText>
               </w:r>
@@ -4274,12 +4299,12 @@
             <w:r>
               <w:t xml:space="preserve"> video, audio, and graphics.  </w:t>
             </w:r>
-            <w:del w:id="201" w:author="Gentry, Mark" w:date="2024-08-18T13:10:00Z" w16du:dateUtc="2024-08-18T17:10:00Z">
+            <w:del w:id="209" w:author="Gentry, Mark" w:date="2024-08-18T13:10:00Z" w16du:dateUtc="2024-08-18T17:10:00Z">
               <w:r>
                 <w:delText xml:space="preserve">This role required me to quickly </w:delText>
               </w:r>
             </w:del>
-            <w:ins w:id="202" w:author="Gentry, Mark" w:date="2024-08-18T13:10:00Z" w16du:dateUtc="2024-08-18T17:10:00Z">
+            <w:ins w:id="210" w:author="Gentry, Mark" w:date="2024-08-18T13:10:00Z" w16du:dateUtc="2024-08-18T17:10:00Z">
               <w:r>
                 <w:t xml:space="preserve">Quickly </w:t>
               </w:r>
@@ -4287,7 +4312,7 @@
             <w:r>
               <w:t>develop</w:t>
             </w:r>
-            <w:ins w:id="203" w:author="Gentry, Mark" w:date="2024-08-18T13:10:00Z" w16du:dateUtc="2024-08-18T17:10:00Z">
+            <w:ins w:id="211" w:author="Gentry, Mark" w:date="2024-08-18T13:10:00Z" w16du:dateUtc="2024-08-18T17:10:00Z">
               <w:r>
                 <w:t>ed</w:t>
               </w:r>
@@ -4295,18 +4320,31 @@
             <w:r>
               <w:t xml:space="preserve"> video knowledge </w:t>
             </w:r>
-            <w:ins w:id="204" w:author="Gentry, Mark" w:date="2024-08-18T13:10:00Z" w16du:dateUtc="2024-08-18T17:10:00Z">
+            <w:ins w:id="212" w:author="Gentry, Mark" w:date="2024-08-18T13:10:00Z" w16du:dateUtc="2024-08-18T17:10:00Z">
               <w:r>
                 <w:t xml:space="preserve">needed </w:t>
               </w:r>
             </w:ins>
-            <w:del w:id="205" w:author="Gentry, Mark" w:date="2024-08-18T13:10:00Z" w16du:dateUtc="2024-08-18T17:10:00Z">
+            <w:del w:id="213" w:author="Gentry, Mark" w:date="2024-08-18T13:10:00Z" w16du:dateUtc="2024-08-18T17:10:00Z">
               <w:r>
                 <w:delText xml:space="preserve">and </w:delText>
               </w:r>
             </w:del>
             <w:r>
-              <w:t xml:space="preserve">to help debug multimedia hardware subsystem.  Required to understand advantages and disadvantages of using </w:t>
+              <w:t xml:space="preserve">to help debug multimedia </w:t>
+            </w:r>
+            <w:del w:id="214" w:author="Gentry, Mark" w:date="2024-08-24T13:01:00Z" w16du:dateUtc="2024-08-24T17:01:00Z">
+              <w:r>
+                <w:delText>hardware</w:delText>
+              </w:r>
+            </w:del>
+            <w:ins w:id="215" w:author="Gentry, Mark" w:date="2024-08-24T13:01:00Z" w16du:dateUtc="2024-08-24T17:01:00Z">
+              <w:r>
+                <w:t>HW</w:t>
+              </w:r>
+            </w:ins>
+            <w:r>
+              <w:t xml:space="preserve"> subsystem.  Required to understand advantages and disadvantages of using </w:t>
             </w:r>
             <w:proofErr w:type="spellStart"/>
             <w:r>
@@ -4394,7 +4432,7 @@
             <w:r>
               <w:t xml:space="preserve">Responsible for implementing closed-captioning feature.  Utilized existing </w:t>
             </w:r>
-            <w:del w:id="206" w:author="Gentry, Mark" w:date="2024-08-14T08:37:00Z" w16du:dateUtc="2024-08-14T12:37:00Z">
+            <w:del w:id="216" w:author="Gentry, Mark" w:date="2024-08-14T08:37:00Z" w16du:dateUtc="2024-08-14T12:37:00Z">
               <w:r>
                 <w:delText xml:space="preserve">interprocessor </w:delText>
               </w:r>
@@ -4438,12 +4476,12 @@
             <w:r>
               <w:t xml:space="preserve">  </w:t>
             </w:r>
-            <w:del w:id="207" w:author="Gentry, Mark" w:date="2024-08-18T13:37:00Z" w16du:dateUtc="2024-08-18T17:37:00Z">
+            <w:del w:id="217" w:author="Gentry, Mark" w:date="2024-08-18T13:37:00Z" w16du:dateUtc="2024-08-18T17:37:00Z">
               <w:r>
                 <w:delText xml:space="preserve">Development environment was Windows NT version of </w:delText>
               </w:r>
             </w:del>
-            <w:ins w:id="208" w:author="Gentry, Mark" w:date="2024-08-18T13:37:00Z" w16du:dateUtc="2024-08-18T17:37:00Z">
+            <w:ins w:id="218" w:author="Gentry, Mark" w:date="2024-08-18T13:37:00Z" w16du:dateUtc="2024-08-18T17:37:00Z">
               <w:r>
                 <w:t xml:space="preserve">Used </w:t>
               </w:r>
@@ -4451,7 +4489,7 @@
             <w:r>
               <w:t xml:space="preserve">Tornado (VxWorks, </w:t>
             </w:r>
-            <w:ins w:id="209" w:author="Gentry, Mark" w:date="2024-08-18T13:38:00Z" w16du:dateUtc="2024-08-18T17:38:00Z">
+            <w:ins w:id="219" w:author="Gentry, Mark" w:date="2024-08-18T13:38:00Z" w16du:dateUtc="2024-08-18T17:38:00Z">
               <w:r>
                 <w:t xml:space="preserve">GNU </w:t>
               </w:r>
@@ -4459,22 +4497,22 @@
             <w:r>
               <w:t>C/C++)</w:t>
             </w:r>
-            <w:ins w:id="210" w:author="Gentry, Mark" w:date="2024-08-18T13:37:00Z" w16du:dateUtc="2024-08-18T17:37:00Z">
+            <w:ins w:id="220" w:author="Gentry, Mark" w:date="2024-08-18T13:37:00Z" w16du:dateUtc="2024-08-18T17:37:00Z">
               <w:r>
                 <w:t xml:space="preserve"> development environment</w:t>
               </w:r>
             </w:ins>
-            <w:ins w:id="211" w:author="Gentry, Mark" w:date="2024-08-18T13:38:00Z" w16du:dateUtc="2024-08-18T17:38:00Z">
+            <w:ins w:id="221" w:author="Gentry, Mark" w:date="2024-08-18T13:38:00Z" w16du:dateUtc="2024-08-18T17:38:00Z">
               <w:r>
                 <w:t xml:space="preserve"> and remote debugging</w:t>
               </w:r>
             </w:ins>
-            <w:del w:id="212" w:author="Gentry, Mark" w:date="2024-08-18T13:38:00Z" w16du:dateUtc="2024-08-18T17:38:00Z">
+            <w:del w:id="222" w:author="Gentry, Mark" w:date="2024-08-18T13:38:00Z" w16du:dateUtc="2024-08-18T17:38:00Z">
               <w:r>
                 <w:delText>.  Developed using GNU development tools.  Remote debugging environment over TCP/IP</w:delText>
               </w:r>
             </w:del>
-            <w:del w:id="213" w:author="Gentry, Mark" w:date="2024-08-14T08:38:00Z" w16du:dateUtc="2024-08-14T12:38:00Z">
+            <w:del w:id="223" w:author="Gentry, Mark" w:date="2024-08-14T08:38:00Z" w16du:dateUtc="2024-08-14T12:38:00Z">
               <w:r>
                 <w:delText>.  Used Clearcase for project CM and mentored team in CM</w:delText>
               </w:r>
@@ -4643,7 +4681,7 @@
                 <w:sz w:val="22"/>
               </w:rPr>
             </w:pPr>
-            <w:del w:id="214" w:author="Gentry, Mark" w:date="2024-08-18T10:58:00Z" w16du:dateUtc="2024-08-18T14:58:00Z">
+            <w:del w:id="224" w:author="Gentry, Mark" w:date="2024-08-18T10:58:00Z" w16du:dateUtc="2024-08-18T14:58:00Z">
               <w:r>
                 <w:rPr>
                   <w:rFonts w:ascii="Times New Roman" w:hAnsi="Times New Roman"/>
@@ -4698,26 +4736,26 @@
               <w:rPr>
                 <w:b/>
                 <w:bCs/>
-                <w:rPrChange w:id="215" w:author="Gentry, Mark" w:date="2024-08-18T13:12:00Z" w16du:dateUtc="2024-08-18T17:12:00Z">
+                <w:rPrChange w:id="225" w:author="Gentry, Mark" w:date="2024-08-18T13:12:00Z" w16du:dateUtc="2024-08-18T17:12:00Z">
                   <w:rPr/>
                 </w:rPrChange>
               </w:rPr>
             </w:pPr>
-            <w:bookmarkStart w:id="216" w:name="cirrusSummary"/>
-            <w:bookmarkEnd w:id="216"/>
-            <w:del w:id="217" w:author="Gentry, Mark" w:date="2024-08-18T13:28:00Z" w16du:dateUtc="2024-08-18T17:28:00Z">
+            <w:bookmarkStart w:id="226" w:name="cirrusSummary"/>
+            <w:bookmarkEnd w:id="226"/>
+            <w:del w:id="227" w:author="Gentry, Mark" w:date="2024-08-18T13:28:00Z" w16du:dateUtc="2024-08-18T17:28:00Z">
               <w:r>
                 <w:rPr>
                   <w:b/>
                   <w:bCs/>
-                  <w:rPrChange w:id="218" w:author="Gentry, Mark" w:date="2024-08-18T13:12:00Z" w16du:dateUtc="2024-08-18T17:12:00Z">
+                  <w:rPrChange w:id="228" w:author="Gentry, Mark" w:date="2024-08-18T13:12:00Z" w16du:dateUtc="2024-08-18T17:12:00Z">
                     <w:rPr/>
                   </w:rPrChange>
                 </w:rPr>
                 <w:delText xml:space="preserve">Senior member of team developing </w:delText>
               </w:r>
             </w:del>
-            <w:ins w:id="219" w:author="Gentry, Mark" w:date="2024-08-18T13:28:00Z" w16du:dateUtc="2024-08-18T17:28:00Z">
+            <w:ins w:id="229" w:author="Gentry, Mark" w:date="2024-08-18T13:28:00Z" w16du:dateUtc="2024-08-18T17:28:00Z">
               <w:r>
                 <w:rPr>
                   <w:b/>
@@ -4730,30 +4768,92 @@
               <w:rPr>
                 <w:b/>
                 <w:bCs/>
-                <w:rPrChange w:id="220" w:author="Gentry, Mark" w:date="2024-08-18T13:12:00Z" w16du:dateUtc="2024-08-18T17:12:00Z">
+                <w:rPrChange w:id="230" w:author="Gentry, Mark" w:date="2024-08-18T13:12:00Z" w16du:dateUtc="2024-08-18T17:12:00Z">
                   <w:rPr/>
                 </w:rPrChange>
               </w:rPr>
-              <w:t xml:space="preserve">PC audio products for Crystal. DSP and microcontroller firmware, Windows audio driver, and other software development/management for seven generations of Crystal audio parts. Responsible for compatibility of these products with industry standards. Products designed in at several OEMs including Dell, HP, and IBM.  Chip bringup and hardware debugging using logic analyzers, scopes, </w:t>
-            </w:r>
-            <w:del w:id="221" w:author="Gentry, Mark" w:date="2024-08-18T13:12:00Z" w16du:dateUtc="2024-08-18T17:12:00Z">
+              <w:t xml:space="preserve">PC audio products for Crystal. DSP and microcontroller firmware, Windows audio driver, and other </w:t>
+            </w:r>
+            <w:del w:id="231" w:author="Gentry, Mark" w:date="2024-08-24T13:00:00Z" w16du:dateUtc="2024-08-24T17:00:00Z">
               <w:r>
                 <w:rPr>
                   <w:b/>
                   <w:bCs/>
-                  <w:rPrChange w:id="222" w:author="Gentry, Mark" w:date="2024-08-18T13:12:00Z" w16du:dateUtc="2024-08-18T17:12:00Z">
+                  <w:rPrChange w:id="232" w:author="Gentry, Mark" w:date="2024-08-18T13:12:00Z" w16du:dateUtc="2024-08-18T17:12:00Z">
+                    <w:rPr/>
+                  </w:rPrChange>
+                </w:rPr>
+                <w:delText>software</w:delText>
+              </w:r>
+            </w:del>
+            <w:ins w:id="233" w:author="Gentry, Mark" w:date="2024-08-24T13:00:00Z" w16du:dateUtc="2024-08-24T17:00:00Z">
+              <w:r>
+                <w:rPr>
+                  <w:b/>
+                  <w:bCs/>
+                </w:rPr>
+                <w:t>SW</w:t>
+              </w:r>
+            </w:ins>
+            <w:r>
+              <w:rPr>
+                <w:b/>
+                <w:bCs/>
+                <w:rPrChange w:id="234" w:author="Gentry, Mark" w:date="2024-08-18T13:12:00Z" w16du:dateUtc="2024-08-18T17:12:00Z">
+                  <w:rPr/>
+                </w:rPrChange>
+              </w:rPr>
+              <w:t xml:space="preserve"> development/management for seven generations of Crystal audio parts. Responsible for compatibility of these products with industry standards. Products designed in at several OEMs including Dell, HP, and IBM.  Chip bringup and </w:t>
+            </w:r>
+            <w:del w:id="235" w:author="Gentry, Mark" w:date="2024-08-24T13:01:00Z" w16du:dateUtc="2024-08-24T17:01:00Z">
+              <w:r>
+                <w:rPr>
+                  <w:b/>
+                  <w:bCs/>
+                  <w:rPrChange w:id="236" w:author="Gentry, Mark" w:date="2024-08-18T13:12:00Z" w16du:dateUtc="2024-08-18T17:12:00Z">
+                    <w:rPr/>
+                  </w:rPrChange>
+                </w:rPr>
+                <w:delText>hardware</w:delText>
+              </w:r>
+            </w:del>
+            <w:ins w:id="237" w:author="Gentry, Mark" w:date="2024-08-24T13:01:00Z" w16du:dateUtc="2024-08-24T17:01:00Z">
+              <w:r>
+                <w:rPr>
+                  <w:b/>
+                  <w:bCs/>
+                </w:rPr>
+                <w:t>HW</w:t>
+              </w:r>
+            </w:ins>
+            <w:r>
+              <w:rPr>
+                <w:b/>
+                <w:bCs/>
+                <w:rPrChange w:id="238" w:author="Gentry, Mark" w:date="2024-08-18T13:12:00Z" w16du:dateUtc="2024-08-18T17:12:00Z">
+                  <w:rPr/>
+                </w:rPrChange>
+              </w:rPr>
+              <w:t xml:space="preserve"> debugging using logic analyzers, scopes, </w:t>
+            </w:r>
+            <w:del w:id="239" w:author="Gentry, Mark" w:date="2024-08-18T13:12:00Z" w16du:dateUtc="2024-08-18T17:12:00Z">
+              <w:r>
+                <w:rPr>
+                  <w:b/>
+                  <w:bCs/>
+                  <w:rPrChange w:id="240" w:author="Gentry, Mark" w:date="2024-08-18T13:12:00Z" w16du:dateUtc="2024-08-18T17:12:00Z">
                     <w:rPr/>
                   </w:rPrChange>
                 </w:rPr>
                 <w:delText>etc</w:delText>
               </w:r>
             </w:del>
-            <w:ins w:id="223" w:author="Gentry, Mark" w:date="2024-08-18T13:12:00Z" w16du:dateUtc="2024-08-18T17:12:00Z">
+            <w:ins w:id="241" w:author="Gentry, Mark" w:date="2024-08-18T13:12:00Z" w16du:dateUtc="2024-08-18T17:12:00Z">
               <w:r>
                 <w:rPr>
                   <w:b/>
                   <w:bCs/>
-                  <w:rPrChange w:id="224" w:author="Gentry, Mark" w:date="2024-08-18T13:12:00Z" w16du:dateUtc="2024-08-18T17:12:00Z">
+                  <w:rPrChange w:id="242" w:author="Gentry, Mark" w:date="2024-08-18T13:12:00Z" w16du:dateUtc="2024-08-18T17:12:00Z">
                     <w:rPr/>
                   </w:rPrChange>
                 </w:rPr>
@@ -4840,7 +4940,7 @@
               </w:rPr>
               <w:t xml:space="preserve">Audio </w:t>
             </w:r>
-            <w:del w:id="225" w:author="Gentry, Mark" w:date="2024-08-21T08:23:00Z" w16du:dateUtc="2024-08-21T12:23:00Z">
+            <w:del w:id="243" w:author="Gentry, Mark" w:date="2024-08-21T08:23:00Z" w16du:dateUtc="2024-08-21T12:23:00Z">
               <w:r>
                 <w:rPr>
                   <w:rFonts w:ascii="Times New Roman" w:hAnsi="Times New Roman"/>
@@ -4850,7 +4950,1391 @@
                 <w:delText xml:space="preserve">Software </w:delText>
               </w:r>
             </w:del>
-            <w:ins w:id="226" w:author="Gentry, Mark" w:date="2024-08-21T08:23:00Z" w16du:dateUtc="2024-08-21T12:23:00Z">
+            <w:ins w:id="244" w:author="Gentry, Mark" w:date="2024-08-21T08:23:00Z" w16du:dateUtc="2024-08-21T12:23:00Z">
+              <w:r>
+                <w:rPr>
+                  <w:rFonts w:ascii="Times New Roman" w:hAnsi="Times New Roman"/>
+                  <w:b/>
+                  <w:sz w:val="22"/>
+                </w:rPr>
+                <w:t xml:space="preserve">SW </w:t>
+              </w:r>
+            </w:ins>
+            <w:r>
+              <w:rPr>
+                <w:rFonts w:ascii="Times New Roman" w:hAnsi="Times New Roman"/>
+                <w:b/>
+                <w:sz w:val="22"/>
+              </w:rPr>
+              <w:t>Manager</w:t>
+            </w:r>
+          </w:p>
+        </w:tc>
+      </w:tr>
+      <w:tr>
+        <w:trPr>
+          <w:cantSplit/>
+        </w:trPr>
+        <w:tc>
+          <w:tcPr>
+            <w:tcW w:w="782" w:type="dxa"/>
+          </w:tcPr>
+          <w:p>
+            <w:pPr>
+              <w:rPr>
+                <w:rFonts w:ascii="Times New Roman" w:hAnsi="Times New Roman"/>
+                <w:sz w:val="22"/>
+              </w:rPr>
+            </w:pPr>
+          </w:p>
+        </w:tc>
+        <w:tc>
+          <w:tcPr>
+            <w:tcW w:w="8460" w:type="dxa"/>
+            <w:gridSpan w:val="3"/>
+          </w:tcPr>
+          <w:p>
+            <w:pPr>
+              <w:pStyle w:val="ResumeBullet"/>
+            </w:pPr>
+            <w:bookmarkStart w:id="245" w:name="cirrusManager"/>
+            <w:bookmarkEnd w:id="245"/>
+            <w:r>
+              <w:sym w:font="Symbol" w:char="F0B7"/>
+            </w:r>
+            <w:r>
+              <w:t xml:space="preserve">  Manage</w:t>
+            </w:r>
+            <w:ins w:id="246" w:author="Gentry, Mark" w:date="2024-08-18T13:12:00Z" w16du:dateUtc="2024-08-18T17:12:00Z">
+              <w:r>
+                <w:t>d</w:t>
+              </w:r>
+            </w:ins>
+            <w:r>
+              <w:t xml:space="preserve"> group responsible for implementation of new audio features on Crystal's DSP-based parts.  Features include DLS wave-table synthesis, 3D audio, four-channel support, EQ, and audio effects.  Group </w:t>
+            </w:r>
+            <w:r>
+              <w:t>wa</w:t>
+            </w:r>
+            <w:r>
+              <w:t>s also responsible for defining DSP resource (memory, MIPs) management policy.</w:t>
+            </w:r>
+          </w:p>
+        </w:tc>
+      </w:tr>
+      <w:tr>
+        <w:trPr>
+          <w:cantSplit/>
+        </w:trPr>
+        <w:tc>
+          <w:tcPr>
+            <w:tcW w:w="782" w:type="dxa"/>
+          </w:tcPr>
+          <w:p>
+            <w:pPr>
+              <w:rPr>
+                <w:rFonts w:ascii="Times New Roman" w:hAnsi="Times New Roman"/>
+                <w:sz w:val="22"/>
+              </w:rPr>
+            </w:pPr>
+          </w:p>
+        </w:tc>
+        <w:tc>
+          <w:tcPr>
+            <w:tcW w:w="8460" w:type="dxa"/>
+            <w:gridSpan w:val="3"/>
+          </w:tcPr>
+          <w:p>
+            <w:pPr>
+              <w:pStyle w:val="ResumeBullet"/>
+            </w:pPr>
+            <w:r>
+              <w:sym w:font="Symbol" w:char="F0B7"/>
+            </w:r>
+            <w:r>
+              <w:t xml:space="preserve">  </w:t>
+            </w:r>
+            <w:r>
+              <w:t>Develop</w:t>
+            </w:r>
+            <w:r>
+              <w:t>ed</w:t>
+            </w:r>
+            <w:r>
+              <w:t xml:space="preserve"> and manage</w:t>
+            </w:r>
+            <w:r>
+              <w:t>d</w:t>
+            </w:r>
+            <w:r>
+              <w:t xml:space="preserve"> development of Windows drivers (wave, mixer, MIDI, DirectSound) for PCI audio accelerators</w:t>
+            </w:r>
+            <w:del w:id="247" w:author="Gentry, Mark" w:date="2024-08-16T22:46:00Z" w16du:dateUtc="2024-08-17T02:46:00Z">
+              <w:r>
+                <w:delText>.  Majority of PCI device driver code common across Windows 95/98, Windows NT, and WDM</w:delText>
+              </w:r>
+            </w:del>
+            <w:r>
+              <w:t>.</w:t>
+            </w:r>
+          </w:p>
+        </w:tc>
+      </w:tr>
+      <w:tr>
+        <w:trPr>
+          <w:cantSplit/>
+        </w:trPr>
+        <w:tc>
+          <w:tcPr>
+            <w:tcW w:w="782" w:type="dxa"/>
+          </w:tcPr>
+          <w:p>
+            <w:pPr>
+              <w:rPr>
+                <w:rFonts w:ascii="Times New Roman" w:hAnsi="Times New Roman"/>
+                <w:sz w:val="22"/>
+              </w:rPr>
+            </w:pPr>
+          </w:p>
+        </w:tc>
+        <w:tc>
+          <w:tcPr>
+            <w:tcW w:w="8460" w:type="dxa"/>
+            <w:gridSpan w:val="3"/>
+          </w:tcPr>
+          <w:p>
+            <w:pPr>
+              <w:pStyle w:val="ResumeBullet"/>
+            </w:pPr>
+            <w:r>
+              <w:sym w:font="Symbol" w:char="F0B7"/>
+            </w:r>
+            <w:r>
+              <w:t xml:space="preserve">  </w:t>
+            </w:r>
+            <w:r>
+              <w:t>Developed DSP code for Crystal's proprietary DSP and help</w:t>
+            </w:r>
+            <w:ins w:id="248" w:author="Gentry, Mark" w:date="2024-08-18T13:13:00Z" w16du:dateUtc="2024-08-18T17:13:00Z">
+              <w:r>
+                <w:t>ed</w:t>
+              </w:r>
+            </w:ins>
+            <w:r>
+              <w:t xml:space="preserve"> define</w:t>
+            </w:r>
+            <w:del w:id="249" w:author="Gentry, Mark" w:date="2024-08-18T13:13:00Z" w16du:dateUtc="2024-08-18T17:13:00Z">
+              <w:r>
+                <w:delText>d</w:delText>
+              </w:r>
+            </w:del>
+            <w:r>
+              <w:t xml:space="preserve"> </w:t>
+            </w:r>
+            <w:del w:id="250" w:author="Gentry, Mark" w:date="2024-08-24T13:01:00Z" w16du:dateUtc="2024-08-24T17:01:00Z">
+              <w:r>
+                <w:delText>hardware</w:delText>
+              </w:r>
+            </w:del>
+            <w:ins w:id="251" w:author="Gentry, Mark" w:date="2024-08-24T13:01:00Z" w16du:dateUtc="2024-08-24T17:01:00Z">
+              <w:r>
+                <w:t>HW</w:t>
+              </w:r>
+            </w:ins>
+            <w:r>
+              <w:t xml:space="preserve"> architecture to make PCI audio parts compatible with DOS </w:t>
+            </w:r>
+            <w:ins w:id="252" w:author="Gentry, Mark" w:date="2024-08-14T08:41:00Z" w16du:dateUtc="2024-08-14T12:41:00Z">
+              <w:r>
+                <w:t xml:space="preserve">(legacy) </w:t>
+              </w:r>
+            </w:ins>
+            <w:r>
+              <w:t>games.</w:t>
+            </w:r>
+          </w:p>
+        </w:tc>
+      </w:tr>
+      <w:tr>
+        <w:trPr>
+          <w:cantSplit/>
+        </w:trPr>
+        <w:tc>
+          <w:tcPr>
+            <w:tcW w:w="782" w:type="dxa"/>
+          </w:tcPr>
+          <w:p>
+            <w:pPr>
+              <w:rPr>
+                <w:rFonts w:ascii="Times New Roman" w:hAnsi="Times New Roman"/>
+                <w:sz w:val="22"/>
+              </w:rPr>
+            </w:pPr>
+          </w:p>
+        </w:tc>
+        <w:tc>
+          <w:tcPr>
+            <w:tcW w:w="8460" w:type="dxa"/>
+            <w:gridSpan w:val="3"/>
+          </w:tcPr>
+          <w:p>
+            <w:pPr>
+              <w:pStyle w:val="ResumeBullet"/>
+            </w:pPr>
+            <w:r>
+              <w:sym w:font="Symbol" w:char="F0B7"/>
+            </w:r>
+            <w:r>
+              <w:t xml:space="preserve">  Led effort to have PCI audio parts designed into embedded systems (auto, set-top). Wr</w:t>
+            </w:r>
+            <w:r>
+              <w:t>o</w:t>
+            </w:r>
+            <w:r>
+              <w:t>te specs, develop</w:t>
+            </w:r>
+            <w:r>
+              <w:t>ed</w:t>
+            </w:r>
+            <w:r>
+              <w:t xml:space="preserve"> sample code, and work</w:t>
+            </w:r>
+            <w:r>
+              <w:t>ed</w:t>
+            </w:r>
+            <w:r>
+              <w:t xml:space="preserve"> with customers </w:t>
+            </w:r>
+            <w:del w:id="253" w:author="Gentry, Mark" w:date="2024-08-14T08:41:00Z" w16du:dateUtc="2024-08-14T12:41:00Z">
+              <w:r>
+                <w:delText>in order to</w:delText>
+              </w:r>
+            </w:del>
+            <w:ins w:id="254" w:author="Gentry, Mark" w:date="2024-08-14T08:41:00Z" w16du:dateUtc="2024-08-14T12:41:00Z">
+              <w:r>
+                <w:t>to</w:t>
+              </w:r>
+            </w:ins>
+            <w:r>
+              <w:t xml:space="preserve"> do this</w:t>
+            </w:r>
+            <w:del w:id="255" w:author="Gentry, Mark" w:date="2024-08-18T13:40:00Z" w16du:dateUtc="2024-08-18T17:40:00Z">
+              <w:r>
+                <w:delText xml:space="preserve">.  This same work </w:delText>
+              </w:r>
+            </w:del>
+            <w:del w:id="256" w:author="Gentry, Mark" w:date="2024-08-14T08:41:00Z" w16du:dateUtc="2024-08-14T12:41:00Z">
+              <w:r>
+                <w:delText xml:space="preserve">has </w:delText>
+              </w:r>
+            </w:del>
+            <w:del w:id="257" w:author="Gentry, Mark" w:date="2024-08-18T13:40:00Z" w16du:dateUtc="2024-08-18T17:40:00Z">
+              <w:r>
+                <w:delText>resulted in third parties being able to develop Linux drivers for Crystal PCI audio parts</w:delText>
+              </w:r>
+            </w:del>
+            <w:r>
+              <w:t>.</w:t>
+            </w:r>
+          </w:p>
+        </w:tc>
+      </w:tr>
+      <w:tr>
+        <w:trPr>
+          <w:cantSplit/>
+        </w:trPr>
+        <w:tc>
+          <w:tcPr>
+            <w:tcW w:w="782" w:type="dxa"/>
+          </w:tcPr>
+          <w:p>
+            <w:pPr>
+              <w:rPr>
+                <w:rFonts w:ascii="Times New Roman" w:hAnsi="Times New Roman"/>
+                <w:sz w:val="22"/>
+              </w:rPr>
+            </w:pPr>
+          </w:p>
+        </w:tc>
+        <w:tc>
+          <w:tcPr>
+            <w:tcW w:w="8460" w:type="dxa"/>
+            <w:gridSpan w:val="3"/>
+          </w:tcPr>
+          <w:p>
+            <w:pPr>
+              <w:pStyle w:val="ResumeBullet"/>
+            </w:pPr>
+            <w:r>
+              <w:sym w:font="Symbol" w:char="F0B7"/>
+            </w:r>
+            <w:r>
+              <w:t xml:space="preserve">  Developed and managed development of Windows drivers (wave, mixer, MIDI, DirectSound) for ISA CODECs</w:t>
+            </w:r>
+            <w:del w:id="258" w:author="Gentry, Mark" w:date="2024-08-16T22:46:00Z" w16du:dateUtc="2024-08-17T02:46:00Z">
+              <w:r>
+                <w:delText>. Also managed development of Windows NT and Windows 3.1 drivers for these products</w:delText>
+              </w:r>
+            </w:del>
+            <w:r>
+              <w:t>.</w:t>
+            </w:r>
+          </w:p>
+        </w:tc>
+      </w:tr>
+      <w:tr>
+        <w:trPr>
+          <w:cantSplit/>
+        </w:trPr>
+        <w:tc>
+          <w:tcPr>
+            <w:tcW w:w="782" w:type="dxa"/>
+          </w:tcPr>
+          <w:p>
+            <w:pPr>
+              <w:rPr>
+                <w:rFonts w:ascii="Times New Roman" w:hAnsi="Times New Roman"/>
+                <w:sz w:val="22"/>
+              </w:rPr>
+            </w:pPr>
+          </w:p>
+        </w:tc>
+        <w:tc>
+          <w:tcPr>
+            <w:tcW w:w="8460" w:type="dxa"/>
+            <w:gridSpan w:val="3"/>
+          </w:tcPr>
+          <w:p>
+            <w:pPr>
+              <w:pStyle w:val="ResumeBullet"/>
+            </w:pPr>
+            <w:r>
+              <w:sym w:font="Symbol" w:char="F0B7"/>
+            </w:r>
+            <w:r>
+              <w:t xml:space="preserve">  Programming classes at University of Texas.</w:t>
+            </w:r>
+          </w:p>
+        </w:tc>
+      </w:tr>
+      <w:tr>
+        <w:trPr>
+          <w:cantSplit/>
+        </w:trPr>
+        <w:tc>
+          <w:tcPr>
+            <w:tcW w:w="782" w:type="dxa"/>
+          </w:tcPr>
+          <w:p>
+            <w:pPr>
+              <w:rPr>
+                <w:rFonts w:ascii="Times New Roman" w:hAnsi="Times New Roman"/>
+                <w:sz w:val="22"/>
+              </w:rPr>
+            </w:pPr>
+          </w:p>
+        </w:tc>
+        <w:tc>
+          <w:tcPr>
+            <w:tcW w:w="8460" w:type="dxa"/>
+            <w:gridSpan w:val="3"/>
+          </w:tcPr>
+          <w:p>
+            <w:pPr>
+              <w:pStyle w:val="ResumeBullet"/>
+            </w:pPr>
+          </w:p>
+        </w:tc>
+      </w:tr>
+      <w:tr>
+        <w:trPr>
+          <w:cantSplit/>
+        </w:trPr>
+        <w:tc>
+          <w:tcPr>
+            <w:tcW w:w="1862" w:type="dxa"/>
+            <w:gridSpan w:val="2"/>
+          </w:tcPr>
+          <w:p>
+            <w:pPr>
+              <w:rPr>
+                <w:rFonts w:ascii="Times New Roman" w:hAnsi="Times New Roman"/>
+                <w:b/>
+                <w:sz w:val="22"/>
+              </w:rPr>
+            </w:pPr>
+            <w:r>
+              <w:rPr>
+                <w:rFonts w:ascii="Times New Roman" w:hAnsi="Times New Roman"/>
+                <w:b/>
+                <w:sz w:val="22"/>
+              </w:rPr>
+              <w:t>1994 – 1996</w:t>
+            </w:r>
+          </w:p>
+        </w:tc>
+        <w:tc>
+          <w:tcPr>
+            <w:tcW w:w="7380" w:type="dxa"/>
+            <w:gridSpan w:val="2"/>
+          </w:tcPr>
+          <w:p>
+            <w:pPr>
+              <w:rPr>
+                <w:rFonts w:ascii="Times New Roman" w:hAnsi="Times New Roman"/>
+                <w:b/>
+                <w:sz w:val="22"/>
+              </w:rPr>
+            </w:pPr>
+            <w:r>
+              <w:rPr>
+                <w:rFonts w:ascii="Times New Roman" w:hAnsi="Times New Roman"/>
+                <w:b/>
+                <w:sz w:val="22"/>
+              </w:rPr>
+              <w:t xml:space="preserve">Embedded Audio </w:t>
+            </w:r>
+            <w:del w:id="259" w:author="Gentry, Mark" w:date="2024-08-21T08:23:00Z" w16du:dateUtc="2024-08-21T12:23:00Z">
+              <w:r>
+                <w:rPr>
+                  <w:rFonts w:ascii="Times New Roman" w:hAnsi="Times New Roman"/>
+                  <w:b/>
+                  <w:sz w:val="22"/>
+                </w:rPr>
+                <w:delText xml:space="preserve">Software </w:delText>
+              </w:r>
+            </w:del>
+            <w:ins w:id="260" w:author="Gentry, Mark" w:date="2024-08-21T08:23:00Z" w16du:dateUtc="2024-08-21T12:23:00Z">
+              <w:r>
+                <w:rPr>
+                  <w:rFonts w:ascii="Times New Roman" w:hAnsi="Times New Roman"/>
+                  <w:b/>
+                  <w:sz w:val="22"/>
+                </w:rPr>
+                <w:t xml:space="preserve">SW </w:t>
+              </w:r>
+            </w:ins>
+            <w:r>
+              <w:rPr>
+                <w:rFonts w:ascii="Times New Roman" w:hAnsi="Times New Roman"/>
+                <w:b/>
+                <w:sz w:val="22"/>
+              </w:rPr>
+              <w:t>Project Lead</w:t>
+            </w:r>
+          </w:p>
+        </w:tc>
+      </w:tr>
+      <w:tr>
+        <w:trPr>
+          <w:cantSplit/>
+        </w:trPr>
+        <w:tc>
+          <w:tcPr>
+            <w:tcW w:w="782" w:type="dxa"/>
+          </w:tcPr>
+          <w:p>
+            <w:pPr>
+              <w:rPr>
+                <w:rFonts w:ascii="Times New Roman" w:hAnsi="Times New Roman"/>
+                <w:sz w:val="22"/>
+              </w:rPr>
+            </w:pPr>
+          </w:p>
+        </w:tc>
+        <w:tc>
+          <w:tcPr>
+            <w:tcW w:w="8460" w:type="dxa"/>
+            <w:gridSpan w:val="3"/>
+          </w:tcPr>
+          <w:p>
+            <w:pPr>
+              <w:pStyle w:val="ResumeBullet"/>
+            </w:pPr>
+            <w:bookmarkStart w:id="261" w:name="cirrusLead"/>
+            <w:bookmarkEnd w:id="261"/>
+            <w:r>
+              <w:sym w:font="Symbol" w:char="F0B7"/>
+            </w:r>
+            <w:r>
+              <w:t xml:space="preserve">  Managed development of all 8052 firmware in CS4232, CS4236, CS423xB, and CS4235/9.  All these chips included 8052 cores, stereo audio codec, and ISA interface.  Worked closely with chip designers to determine size of patch RAM, deliver ROM code, and add features like mapping codec registers into 8052 SFR space.</w:t>
+            </w:r>
+          </w:p>
+        </w:tc>
+      </w:tr>
+      <w:tr>
+        <w:trPr>
+          <w:cantSplit/>
+        </w:trPr>
+        <w:tc>
+          <w:tcPr>
+            <w:tcW w:w="782" w:type="dxa"/>
+          </w:tcPr>
+          <w:p>
+            <w:pPr>
+              <w:rPr>
+                <w:rFonts w:ascii="Times New Roman" w:hAnsi="Times New Roman"/>
+                <w:sz w:val="22"/>
+              </w:rPr>
+            </w:pPr>
+          </w:p>
+        </w:tc>
+        <w:tc>
+          <w:tcPr>
+            <w:tcW w:w="8460" w:type="dxa"/>
+            <w:gridSpan w:val="3"/>
+          </w:tcPr>
+          <w:p>
+            <w:pPr>
+              <w:pStyle w:val="ResumeBullet"/>
+            </w:pPr>
+            <w:r>
+              <w:sym w:font="Symbol" w:char="F0B7"/>
+            </w:r>
+            <w:r>
+              <w:t xml:space="preserve">  Salvaged production CS4232 </w:t>
+            </w:r>
+            <w:del w:id="262" w:author="Gentry, Mark" w:date="2024-08-16T22:47:00Z" w16du:dateUtc="2024-08-17T02:47:00Z">
+              <w:r>
+                <w:delText xml:space="preserve">and CS4236 </w:delText>
+              </w:r>
+            </w:del>
+            <w:r>
+              <w:t xml:space="preserve">parts by working around </w:t>
+            </w:r>
+            <w:del w:id="263" w:author="Gentry, Mark" w:date="2024-08-24T13:01:00Z" w16du:dateUtc="2024-08-24T17:01:00Z">
+              <w:r>
+                <w:delText>hardware</w:delText>
+              </w:r>
+            </w:del>
+            <w:ins w:id="264" w:author="Gentry, Mark" w:date="2024-08-24T13:01:00Z" w16du:dateUtc="2024-08-24T17:01:00Z">
+              <w:r>
+                <w:t>HW</w:t>
+              </w:r>
+            </w:ins>
+            <w:r>
+              <w:t xml:space="preserve"> problems in firmware.</w:t>
+            </w:r>
+          </w:p>
+        </w:tc>
+      </w:tr>
+      <w:tr>
+        <w:trPr>
+          <w:cantSplit/>
+        </w:trPr>
+        <w:tc>
+          <w:tcPr>
+            <w:tcW w:w="782" w:type="dxa"/>
+          </w:tcPr>
+          <w:p>
+            <w:pPr>
+              <w:rPr>
+                <w:rFonts w:ascii="Times New Roman" w:hAnsi="Times New Roman"/>
+                <w:sz w:val="22"/>
+              </w:rPr>
+            </w:pPr>
+          </w:p>
+        </w:tc>
+        <w:tc>
+          <w:tcPr>
+            <w:tcW w:w="8460" w:type="dxa"/>
+            <w:gridSpan w:val="3"/>
+          </w:tcPr>
+          <w:p>
+            <w:pPr>
+              <w:pStyle w:val="ResumeBullet"/>
+            </w:pPr>
+          </w:p>
+        </w:tc>
+      </w:tr>
+      <w:tr>
+        <w:trPr>
+          <w:cantSplit/>
+        </w:trPr>
+        <w:tc>
+          <w:tcPr>
+            <w:tcW w:w="1862" w:type="dxa"/>
+            <w:gridSpan w:val="2"/>
+          </w:tcPr>
+          <w:p>
+            <w:pPr>
+              <w:rPr>
+                <w:rFonts w:ascii="Times New Roman" w:hAnsi="Times New Roman"/>
+                <w:b/>
+                <w:sz w:val="22"/>
+              </w:rPr>
+            </w:pPr>
+            <w:r>
+              <w:rPr>
+                <w:rFonts w:ascii="Times New Roman" w:hAnsi="Times New Roman"/>
+                <w:b/>
+                <w:sz w:val="22"/>
+              </w:rPr>
+              <w:br w:type="page"/>
+              <w:t>1992 – 1994</w:t>
+            </w:r>
+          </w:p>
+        </w:tc>
+        <w:tc>
+          <w:tcPr>
+            <w:tcW w:w="7380" w:type="dxa"/>
+            <w:gridSpan w:val="2"/>
+          </w:tcPr>
+          <w:p>
+            <w:pPr>
+              <w:rPr>
+                <w:rFonts w:ascii="Times New Roman" w:hAnsi="Times New Roman"/>
+                <w:b/>
+                <w:sz w:val="22"/>
+              </w:rPr>
+            </w:pPr>
+            <w:r>
+              <w:rPr>
+                <w:rFonts w:ascii="Times New Roman" w:hAnsi="Times New Roman"/>
+                <w:b/>
+                <w:sz w:val="22"/>
+              </w:rPr>
+              <w:t xml:space="preserve">Multimedia </w:t>
+            </w:r>
+            <w:del w:id="265" w:author="Gentry, Mark" w:date="2024-08-21T08:23:00Z" w16du:dateUtc="2024-08-21T12:23:00Z">
+              <w:r>
+                <w:rPr>
+                  <w:rFonts w:ascii="Times New Roman" w:hAnsi="Times New Roman"/>
+                  <w:b/>
+                  <w:sz w:val="22"/>
+                </w:rPr>
+                <w:delText xml:space="preserve">Software </w:delText>
+              </w:r>
+            </w:del>
+            <w:ins w:id="266" w:author="Gentry, Mark" w:date="2024-08-21T08:23:00Z" w16du:dateUtc="2024-08-21T12:23:00Z">
+              <w:r>
+                <w:rPr>
+                  <w:rFonts w:ascii="Times New Roman" w:hAnsi="Times New Roman"/>
+                  <w:b/>
+                  <w:sz w:val="22"/>
+                </w:rPr>
+                <w:t xml:space="preserve">SW </w:t>
+              </w:r>
+            </w:ins>
+            <w:r>
+              <w:rPr>
+                <w:rFonts w:ascii="Times New Roman" w:hAnsi="Times New Roman"/>
+                <w:b/>
+                <w:sz w:val="22"/>
+              </w:rPr>
+              <w:t>Engineer</w:t>
+            </w:r>
+          </w:p>
+        </w:tc>
+      </w:tr>
+      <w:tr>
+        <w:trPr>
+          <w:cantSplit/>
+        </w:trPr>
+        <w:tc>
+          <w:tcPr>
+            <w:tcW w:w="782" w:type="dxa"/>
+          </w:tcPr>
+          <w:p>
+            <w:pPr>
+              <w:rPr>
+                <w:rFonts w:ascii="Times New Roman" w:hAnsi="Times New Roman"/>
+                <w:sz w:val="22"/>
+              </w:rPr>
+            </w:pPr>
+          </w:p>
+        </w:tc>
+        <w:tc>
+          <w:tcPr>
+            <w:tcW w:w="8460" w:type="dxa"/>
+            <w:gridSpan w:val="3"/>
+          </w:tcPr>
+          <w:p>
+            <w:pPr>
+              <w:pStyle w:val="ResumeBullet"/>
+            </w:pPr>
+            <w:bookmarkStart w:id="267" w:name="cirrusEngineer"/>
+            <w:bookmarkEnd w:id="267"/>
+            <w:r>
+              <w:sym w:font="Symbol" w:char="F0B7"/>
+            </w:r>
+            <w:r>
+              <w:t xml:space="preserve">  Responsible for compatibility with </w:t>
+            </w:r>
+            <w:del w:id="268" w:author="Gentry, Mark" w:date="2024-08-24T13:01:00Z" w16du:dateUtc="2024-08-24T17:01:00Z">
+              <w:r>
+                <w:delText>hardware</w:delText>
+              </w:r>
+            </w:del>
+            <w:ins w:id="269" w:author="Gentry, Mark" w:date="2024-08-24T13:01:00Z" w16du:dateUtc="2024-08-24T17:01:00Z">
+              <w:r>
+                <w:t>HW</w:t>
+              </w:r>
+            </w:ins>
+            <w:r>
+              <w:t xml:space="preserve"> interfaces used by DOS games (SoundBlaster and MPU-401) on ISA parts and for Plug and Play and APM (advanced power management) compatibility on ISA parts. ISA parts include</w:t>
+            </w:r>
+            <w:r>
+              <w:t>d</w:t>
+            </w:r>
+            <w:r>
+              <w:t xml:space="preserve"> 8052 cores that execute</w:t>
+            </w:r>
+            <w:r>
+              <w:t>d</w:t>
+            </w:r>
+            <w:r>
+              <w:t xml:space="preserve"> code to provide this compatibility.  Developed this code and defined </w:t>
+            </w:r>
+            <w:ins w:id="270" w:author="Gentry, Mark" w:date="2024-08-14T08:46:00Z" w16du:dateUtc="2024-08-14T12:46:00Z">
+              <w:r>
+                <w:t xml:space="preserve">associated </w:t>
+              </w:r>
+            </w:ins>
+            <w:del w:id="271" w:author="Gentry, Mark" w:date="2024-08-24T13:01:00Z" w16du:dateUtc="2024-08-24T17:01:00Z">
+              <w:r>
+                <w:delText>hardware</w:delText>
+              </w:r>
+            </w:del>
+            <w:ins w:id="272" w:author="Gentry, Mark" w:date="2024-08-24T13:01:00Z" w16du:dateUtc="2024-08-24T17:01:00Z">
+              <w:r>
+                <w:t>HW</w:t>
+              </w:r>
+            </w:ins>
+            <w:r>
+              <w:t>/</w:t>
+            </w:r>
+            <w:del w:id="273" w:author="Gentry, Mark" w:date="2024-08-24T13:00:00Z" w16du:dateUtc="2024-08-24T17:00:00Z">
+              <w:r>
+                <w:delText>software</w:delText>
+              </w:r>
+            </w:del>
+            <w:ins w:id="274" w:author="Gentry, Mark" w:date="2024-08-24T13:00:00Z" w16du:dateUtc="2024-08-24T17:00:00Z">
+              <w:r>
+                <w:t>SW</w:t>
+              </w:r>
+            </w:ins>
+            <w:r>
+              <w:t xml:space="preserve"> architecture</w:t>
+            </w:r>
+            <w:del w:id="275" w:author="Gentry, Mark" w:date="2024-08-14T08:46:00Z" w16du:dateUtc="2024-08-14T12:46:00Z">
+              <w:r>
+                <w:delText xml:space="preserve"> required to do so</w:delText>
+              </w:r>
+            </w:del>
+            <w:r>
+              <w:t xml:space="preserve">.  Extensively reverse-engineered games </w:t>
+            </w:r>
+            <w:del w:id="276" w:author="Gentry, Mark" w:date="2024-08-18T13:14:00Z" w16du:dateUtc="2024-08-18T17:14:00Z">
+              <w:r>
+                <w:delText>in order to</w:delText>
+              </w:r>
+            </w:del>
+            <w:ins w:id="277" w:author="Gentry, Mark" w:date="2024-08-18T13:14:00Z" w16du:dateUtc="2024-08-18T17:14:00Z">
+              <w:r>
+                <w:t>to</w:t>
+              </w:r>
+            </w:ins>
+            <w:r>
+              <w:t xml:space="preserve"> implement required</w:t>
+            </w:r>
+            <w:ins w:id="278" w:author="Gentry, Mark" w:date="2024-08-14T08:47:00Z" w16du:dateUtc="2024-08-14T12:47:00Z">
+              <w:r>
+                <w:t>,</w:t>
+              </w:r>
+            </w:ins>
+            <w:r>
+              <w:t xml:space="preserve"> compatible </w:t>
+            </w:r>
+            <w:del w:id="279" w:author="Gentry, Mark" w:date="2024-08-24T13:01:00Z" w16du:dateUtc="2024-08-24T17:01:00Z">
+              <w:r>
+                <w:delText>hardware</w:delText>
+              </w:r>
+            </w:del>
+            <w:ins w:id="280" w:author="Gentry, Mark" w:date="2024-08-24T13:01:00Z" w16du:dateUtc="2024-08-24T17:01:00Z">
+              <w:r>
+                <w:t>HW</w:t>
+              </w:r>
+            </w:ins>
+            <w:r>
+              <w:t xml:space="preserve"> interfaces.</w:t>
+            </w:r>
+          </w:p>
+        </w:tc>
+      </w:tr>
+      <w:tr>
+        <w:trPr>
+          <w:cantSplit/>
+        </w:trPr>
+        <w:tc>
+          <w:tcPr>
+            <w:tcW w:w="782" w:type="dxa"/>
+          </w:tcPr>
+          <w:p>
+            <w:pPr>
+              <w:rPr>
+                <w:rFonts w:ascii="Times New Roman" w:hAnsi="Times New Roman"/>
+                <w:sz w:val="22"/>
+              </w:rPr>
+            </w:pPr>
+          </w:p>
+        </w:tc>
+        <w:tc>
+          <w:tcPr>
+            <w:tcW w:w="8460" w:type="dxa"/>
+            <w:gridSpan w:val="3"/>
+          </w:tcPr>
+          <w:p>
+            <w:pPr>
+              <w:pStyle w:val="ResumeBullet"/>
+            </w:pPr>
+            <w:r>
+              <w:sym w:font="Symbol" w:char="F0B7"/>
+            </w:r>
+            <w:r>
+              <w:t xml:space="preserve">  Defined interfaces between 8052 and ISA bus and 8052 and CODEC core on Crystal's ISA CODECs.</w:t>
+            </w:r>
+          </w:p>
+        </w:tc>
+      </w:tr>
+      <w:tr>
+        <w:trPr>
+          <w:cantSplit/>
+        </w:trPr>
+        <w:tc>
+          <w:tcPr>
+            <w:tcW w:w="782" w:type="dxa"/>
+          </w:tcPr>
+          <w:p>
+            <w:pPr>
+              <w:rPr>
+                <w:rFonts w:ascii="Times New Roman" w:hAnsi="Times New Roman"/>
+                <w:sz w:val="22"/>
+              </w:rPr>
+            </w:pPr>
+          </w:p>
+        </w:tc>
+        <w:tc>
+          <w:tcPr>
+            <w:tcW w:w="8460" w:type="dxa"/>
+            <w:gridSpan w:val="3"/>
+          </w:tcPr>
+          <w:p>
+            <w:pPr>
+              <w:pStyle w:val="ResumeBullet"/>
+            </w:pPr>
+            <w:r>
+              <w:sym w:font="Symbol" w:char="F0B7"/>
+            </w:r>
+            <w:r>
+              <w:t xml:space="preserve">  Wrote diagnostics </w:t>
+            </w:r>
+            <w:del w:id="281" w:author="Gentry, Mark" w:date="2024-08-24T13:00:00Z" w16du:dateUtc="2024-08-24T17:00:00Z">
+              <w:r>
+                <w:delText>software</w:delText>
+              </w:r>
+            </w:del>
+            <w:ins w:id="282" w:author="Gentry, Mark" w:date="2024-08-24T13:00:00Z" w16du:dateUtc="2024-08-24T17:00:00Z">
+              <w:r>
+                <w:t>SW</w:t>
+              </w:r>
+            </w:ins>
+            <w:r>
+              <w:t xml:space="preserve"> in C and x86 assembler for the CS4231 and CS4248. </w:t>
+            </w:r>
+            <w:del w:id="283" w:author="Gentry, Mark" w:date="2024-08-24T13:00:00Z" w16du:dateUtc="2024-08-24T17:00:00Z">
+              <w:r>
+                <w:delText>Software</w:delText>
+              </w:r>
+            </w:del>
+            <w:ins w:id="284" w:author="Gentry, Mark" w:date="2024-08-24T13:00:00Z" w16du:dateUtc="2024-08-24T17:00:00Z">
+              <w:r>
+                <w:t>SW</w:t>
+              </w:r>
+            </w:ins>
+            <w:r>
+              <w:t xml:space="preserve"> tests complete functionality, performance, and feature-sets of these parts and </w:t>
+            </w:r>
+            <w:ins w:id="285" w:author="Gentry, Mark" w:date="2024-08-18T13:14:00Z" w16du:dateUtc="2024-08-18T17:14:00Z">
+              <w:r>
+                <w:t xml:space="preserve">were </w:t>
+              </w:r>
+            </w:ins>
+            <w:del w:id="286" w:author="Gentry, Mark" w:date="2024-08-18T13:14:00Z" w16du:dateUtc="2024-08-18T17:14:00Z">
+              <w:r>
+                <w:delText xml:space="preserve">have been </w:delText>
+              </w:r>
+            </w:del>
+            <w:r>
+              <w:t>used extensively by Crystal chip and board designers as well as by Crystal customers.</w:t>
+            </w:r>
+          </w:p>
+        </w:tc>
+      </w:tr>
+      <w:tr>
+        <w:trPr>
+          <w:cantSplit/>
+        </w:trPr>
+        <w:tc>
+          <w:tcPr>
+            <w:tcW w:w="782" w:type="dxa"/>
+          </w:tcPr>
+          <w:p>
+            <w:pPr>
+              <w:rPr>
+                <w:rFonts w:ascii="Times New Roman" w:hAnsi="Times New Roman"/>
+                <w:sz w:val="22"/>
+              </w:rPr>
+            </w:pPr>
+          </w:p>
+        </w:tc>
+        <w:tc>
+          <w:tcPr>
+            <w:tcW w:w="8460" w:type="dxa"/>
+            <w:gridSpan w:val="3"/>
+          </w:tcPr>
+          <w:p>
+            <w:pPr>
+              <w:pStyle w:val="ResumeBullet"/>
+            </w:pPr>
+          </w:p>
+        </w:tc>
+      </w:tr>
+      <w:tr>
+        <w:trPr>
+          <w:cantSplit/>
+        </w:trPr>
+        <w:tc>
+          <w:tcPr>
+            <w:tcW w:w="1862" w:type="dxa"/>
+            <w:gridSpan w:val="2"/>
+          </w:tcPr>
+          <w:p>
+            <w:pPr>
+              <w:rPr>
+                <w:rFonts w:ascii="Times New Roman" w:hAnsi="Times New Roman"/>
+                <w:sz w:val="22"/>
+              </w:rPr>
+            </w:pPr>
+          </w:p>
+        </w:tc>
+        <w:tc>
+          <w:tcPr>
+            <w:tcW w:w="7380" w:type="dxa"/>
+            <w:gridSpan w:val="2"/>
+          </w:tcPr>
+          <w:p>
+            <w:pPr>
+              <w:rPr>
+                <w:rFonts w:ascii="Times New Roman" w:hAnsi="Times New Roman"/>
+                <w:b/>
+                <w:sz w:val="22"/>
+              </w:rPr>
+            </w:pPr>
+            <w:r>
+              <w:rPr>
+                <w:rFonts w:ascii="Times New Roman" w:hAnsi="Times New Roman"/>
+                <w:b/>
+                <w:sz w:val="22"/>
+              </w:rPr>
+              <w:t>COMPAQ COMPUTER CORPORATION</w:t>
+            </w:r>
+          </w:p>
+          <w:p>
+            <w:pPr>
+              <w:pStyle w:val="mynormal"/>
+              <w:rPr>
+                <w:b/>
+              </w:rPr>
+            </w:pPr>
+            <w:r>
+              <w:t>Houston, Texas</w:t>
+            </w:r>
+          </w:p>
+        </w:tc>
+      </w:tr>
+      <w:tr>
+        <w:trPr>
+          <w:cantSplit/>
+        </w:trPr>
+        <w:tc>
+          <w:tcPr>
+            <w:tcW w:w="1862" w:type="dxa"/>
+            <w:gridSpan w:val="2"/>
+          </w:tcPr>
+          <w:p>
+            <w:pPr>
+              <w:rPr>
+                <w:rFonts w:ascii="Times New Roman" w:hAnsi="Times New Roman"/>
+                <w:b/>
+                <w:sz w:val="22"/>
+              </w:rPr>
+            </w:pPr>
+            <w:r>
+              <w:rPr>
+                <w:rFonts w:ascii="Times New Roman" w:hAnsi="Times New Roman"/>
+                <w:b/>
+                <w:sz w:val="22"/>
+              </w:rPr>
+              <w:t>1991</w:t>
+            </w:r>
+            <w:r>
+              <w:rPr>
+                <w:rFonts w:ascii="Times New Roman" w:hAnsi="Times New Roman"/>
+                <w:b/>
+                <w:sz w:val="22"/>
+              </w:rPr>
+              <w:noBreakHyphen/>
+              <w:t>1992</w:t>
+            </w:r>
+          </w:p>
+          <w:p>
+            <w:pPr>
+              <w:rPr>
+                <w:rFonts w:ascii="Times New Roman" w:hAnsi="Times New Roman"/>
+                <w:b/>
+                <w:sz w:val="22"/>
+              </w:rPr>
+            </w:pPr>
+          </w:p>
+        </w:tc>
+        <w:tc>
+          <w:tcPr>
+            <w:tcW w:w="7380" w:type="dxa"/>
+            <w:gridSpan w:val="2"/>
+          </w:tcPr>
+          <w:p>
+            <w:pPr>
+              <w:rPr>
+                <w:rFonts w:ascii="Times New Roman" w:hAnsi="Times New Roman"/>
+                <w:b/>
+                <w:sz w:val="22"/>
+              </w:rPr>
+            </w:pPr>
+            <w:r>
+              <w:rPr>
+                <w:rFonts w:ascii="Times New Roman" w:hAnsi="Times New Roman"/>
+                <w:b/>
+                <w:sz w:val="22"/>
+              </w:rPr>
+              <w:t>Systems Engineer (Graphics Development)</w:t>
+            </w:r>
+          </w:p>
+        </w:tc>
+      </w:tr>
+      <w:tr>
+        <w:trPr>
+          <w:cantSplit/>
+        </w:trPr>
+        <w:tc>
+          <w:tcPr>
+            <w:tcW w:w="782" w:type="dxa"/>
+          </w:tcPr>
+          <w:p>
+            <w:pPr>
+              <w:rPr>
+                <w:rFonts w:ascii="Times New Roman" w:hAnsi="Times New Roman"/>
+                <w:sz w:val="22"/>
+              </w:rPr>
+            </w:pPr>
+          </w:p>
+        </w:tc>
+        <w:tc>
+          <w:tcPr>
+            <w:tcW w:w="8460" w:type="dxa"/>
+            <w:gridSpan w:val="3"/>
+          </w:tcPr>
+          <w:p>
+            <w:pPr>
+              <w:pStyle w:val="ResumeBullet"/>
+            </w:pPr>
+            <w:bookmarkStart w:id="287" w:name="compaq"/>
+            <w:bookmarkEnd w:id="287"/>
+            <w:r>
+              <w:sym w:font="Symbol" w:char="F0B7"/>
+            </w:r>
+            <w:r>
+              <w:t xml:space="preserve">  Used FPGAs for internal design projects. </w:t>
+            </w:r>
+            <w:del w:id="288" w:author="Gentry, Mark" w:date="2024-08-14T08:50:00Z" w16du:dateUtc="2024-08-14T12:50:00Z">
+              <w:r>
+                <w:delText xml:space="preserve"> Entered equations using ABEL and simulated with Verilog using FPGA and TTL models.  </w:delText>
+              </w:r>
+            </w:del>
+            <w:r>
+              <w:t xml:space="preserve">Designed EISA analysis board to be used for </w:t>
+            </w:r>
+            <w:del w:id="289" w:author="Gentry, Mark" w:date="2024-08-24T13:01:00Z" w16du:dateUtc="2024-08-24T17:01:00Z">
+              <w:r>
+                <w:delText>hardware</w:delText>
+              </w:r>
+            </w:del>
+            <w:ins w:id="290" w:author="Gentry, Mark" w:date="2024-08-24T13:01:00Z" w16du:dateUtc="2024-08-24T17:01:00Z">
+              <w:r>
+                <w:t>HW</w:t>
+              </w:r>
+            </w:ins>
+            <w:r>
+              <w:t xml:space="preserve"> and </w:t>
+            </w:r>
+            <w:del w:id="291" w:author="Gentry, Mark" w:date="2024-08-24T13:00:00Z" w16du:dateUtc="2024-08-24T17:00:00Z">
+              <w:r>
+                <w:delText>software</w:delText>
+              </w:r>
+            </w:del>
+            <w:ins w:id="292" w:author="Gentry, Mark" w:date="2024-08-24T13:00:00Z" w16du:dateUtc="2024-08-24T17:00:00Z">
+              <w:r>
+                <w:t>SW</w:t>
+              </w:r>
+            </w:ins>
+            <w:r>
+              <w:t xml:space="preserve"> profiling of graphics activity.  Partitioned design between MACH devices, standard TTL logic, and specialized logic.</w:t>
+            </w:r>
+          </w:p>
+        </w:tc>
+      </w:tr>
+      <w:tr>
+        <w:trPr>
+          <w:cantSplit/>
+        </w:trPr>
+        <w:tc>
+          <w:tcPr>
+            <w:tcW w:w="782" w:type="dxa"/>
+          </w:tcPr>
+          <w:p>
+            <w:pPr>
+              <w:rPr>
+                <w:rFonts w:ascii="Times New Roman" w:hAnsi="Times New Roman"/>
+                <w:sz w:val="22"/>
+              </w:rPr>
+            </w:pPr>
+          </w:p>
+        </w:tc>
+        <w:tc>
+          <w:tcPr>
+            <w:tcW w:w="8460" w:type="dxa"/>
+            <w:gridSpan w:val="3"/>
+          </w:tcPr>
+          <w:p>
+            <w:pPr>
+              <w:pStyle w:val="ResumeBullet"/>
+            </w:pPr>
+            <w:r>
+              <w:sym w:font="Symbol" w:char="F0B7"/>
+            </w:r>
+            <w:r>
+              <w:t xml:space="preserve">  Evaluated local-bus graphics architectures for 486 bus, VESA Local (VL) Bus, PCI, and Compaq host bus.</w:t>
+            </w:r>
+          </w:p>
+        </w:tc>
+      </w:tr>
+      <w:tr>
+        <w:trPr>
+          <w:cantSplit/>
+        </w:trPr>
+        <w:tc>
+          <w:tcPr>
+            <w:tcW w:w="782" w:type="dxa"/>
+          </w:tcPr>
+          <w:p>
+            <w:pPr>
+              <w:rPr>
+                <w:rFonts w:ascii="Times New Roman" w:hAnsi="Times New Roman"/>
+                <w:sz w:val="22"/>
+              </w:rPr>
+            </w:pPr>
+          </w:p>
+        </w:tc>
+        <w:tc>
+          <w:tcPr>
+            <w:tcW w:w="8460" w:type="dxa"/>
+            <w:gridSpan w:val="3"/>
+          </w:tcPr>
+          <w:p>
+            <w:pPr>
+              <w:pStyle w:val="ResumeBullet"/>
+            </w:pPr>
+            <w:r>
+              <w:sym w:font="Symbol" w:char="F0B7"/>
+            </w:r>
+            <w:r>
+              <w:t xml:space="preserve">  Designed simple audio circuits using Analog Devices A/D and D/A converters and wrote required low-level </w:t>
+            </w:r>
+            <w:del w:id="293" w:author="Gentry, Mark" w:date="2024-08-24T13:00:00Z" w16du:dateUtc="2024-08-24T17:00:00Z">
+              <w:r>
+                <w:delText>software</w:delText>
+              </w:r>
+            </w:del>
+            <w:ins w:id="294" w:author="Gentry, Mark" w:date="2024-08-24T13:00:00Z" w16du:dateUtc="2024-08-24T17:00:00Z">
+              <w:r>
+                <w:t>SW</w:t>
+              </w:r>
+            </w:ins>
+            <w:r>
+              <w:t xml:space="preserve"> while working on Business Audio project.</w:t>
+            </w:r>
+          </w:p>
+        </w:tc>
+      </w:tr>
+      <w:tr>
+        <w:trPr>
+          <w:cantSplit/>
+        </w:trPr>
+        <w:tc>
+          <w:tcPr>
+            <w:tcW w:w="782" w:type="dxa"/>
+          </w:tcPr>
+          <w:p>
+            <w:pPr>
+              <w:rPr>
+                <w:rFonts w:ascii="Times New Roman" w:hAnsi="Times New Roman"/>
+                <w:sz w:val="22"/>
+              </w:rPr>
+            </w:pPr>
+          </w:p>
+        </w:tc>
+        <w:tc>
+          <w:tcPr>
+            <w:tcW w:w="8460" w:type="dxa"/>
+            <w:gridSpan w:val="3"/>
+          </w:tcPr>
+          <w:p>
+            <w:pPr>
+              <w:pStyle w:val="ResumeBullet"/>
+            </w:pPr>
+          </w:p>
+        </w:tc>
+      </w:tr>
+      <w:tr>
+        <w:trPr>
+          <w:cantSplit/>
+        </w:trPr>
+        <w:tc>
+          <w:tcPr>
+            <w:tcW w:w="782" w:type="dxa"/>
+          </w:tcPr>
+          <w:p>
+            <w:pPr>
+              <w:rPr>
+                <w:rFonts w:ascii="Times New Roman" w:hAnsi="Times New Roman"/>
+                <w:sz w:val="22"/>
+              </w:rPr>
+            </w:pPr>
+          </w:p>
+        </w:tc>
+        <w:tc>
+          <w:tcPr>
+            <w:tcW w:w="1080" w:type="dxa"/>
+          </w:tcPr>
+          <w:p>
+            <w:pPr>
+              <w:rPr>
+                <w:rFonts w:ascii="Times New Roman" w:hAnsi="Times New Roman"/>
+                <w:b/>
+                <w:sz w:val="22"/>
+              </w:rPr>
+            </w:pPr>
+          </w:p>
+        </w:tc>
+        <w:tc>
+          <w:tcPr>
+            <w:tcW w:w="7380" w:type="dxa"/>
+            <w:gridSpan w:val="2"/>
+          </w:tcPr>
+          <w:p>
+            <w:pPr>
+              <w:rPr>
+                <w:rFonts w:ascii="Times New Roman" w:hAnsi="Times New Roman"/>
+                <w:b/>
+                <w:sz w:val="22"/>
+              </w:rPr>
+            </w:pPr>
+            <w:r>
+              <w:rPr>
+                <w:rFonts w:ascii="Times New Roman" w:hAnsi="Times New Roman"/>
+                <w:b/>
+                <w:sz w:val="22"/>
+              </w:rPr>
+              <w:t>RESEARCH PLANNING INC.</w:t>
+            </w:r>
+          </w:p>
+          <w:p>
+            <w:pPr>
+              <w:pStyle w:val="mynormal"/>
+              <w:rPr>
+                <w:b/>
+              </w:rPr>
+            </w:pPr>
+            <w:r>
+              <w:t>Arlington, Virginia</w:t>
+            </w:r>
+          </w:p>
+        </w:tc>
+      </w:tr>
+      <w:tr>
+        <w:trPr>
+          <w:cantSplit/>
+        </w:trPr>
+        <w:tc>
+          <w:tcPr>
+            <w:tcW w:w="782" w:type="dxa"/>
+          </w:tcPr>
+          <w:p>
+            <w:pPr>
+              <w:rPr>
+                <w:rFonts w:ascii="Times New Roman" w:hAnsi="Times New Roman"/>
+                <w:b/>
+                <w:sz w:val="22"/>
+              </w:rPr>
+            </w:pPr>
+            <w:r>
+              <w:rPr>
+                <w:rFonts w:ascii="Times New Roman" w:hAnsi="Times New Roman"/>
+                <w:b/>
+                <w:sz w:val="22"/>
+              </w:rPr>
+              <w:t>1989</w:t>
+            </w:r>
+          </w:p>
+        </w:tc>
+        <w:tc>
+          <w:tcPr>
+            <w:tcW w:w="1080" w:type="dxa"/>
+          </w:tcPr>
+          <w:p>
+            <w:pPr>
+              <w:rPr>
+                <w:rFonts w:ascii="Times New Roman" w:hAnsi="Times New Roman"/>
+                <w:b/>
+                <w:sz w:val="22"/>
+              </w:rPr>
+            </w:pPr>
+          </w:p>
+        </w:tc>
+        <w:tc>
+          <w:tcPr>
+            <w:tcW w:w="7380" w:type="dxa"/>
+            <w:gridSpan w:val="2"/>
+          </w:tcPr>
+          <w:p>
+            <w:pPr>
+              <w:rPr>
+                <w:rFonts w:ascii="Times New Roman" w:hAnsi="Times New Roman"/>
+                <w:b/>
+                <w:sz w:val="22"/>
+              </w:rPr>
+            </w:pPr>
+            <w:del w:id="295" w:author="Gentry, Mark" w:date="2024-08-24T13:00:00Z" w16du:dateUtc="2024-08-24T17:00:00Z">
+              <w:r>
+                <w:rPr>
+                  <w:rFonts w:ascii="Times New Roman" w:hAnsi="Times New Roman"/>
+                  <w:b/>
+                  <w:sz w:val="22"/>
+                </w:rPr>
+                <w:delText>Software</w:delText>
+              </w:r>
+            </w:del>
+            <w:ins w:id="296" w:author="Gentry, Mark" w:date="2024-08-24T13:00:00Z" w16du:dateUtc="2024-08-24T17:00:00Z">
               <w:r>
                 <w:rPr>
                   <w:rFonts w:ascii="Times New Roman" w:hAnsi="Times New Roman"/>
@@ -4859,22 +6343,14 @@
                 </w:rPr>
                 <w:t>SW</w:t>
               </w:r>
-              <w:r>
-                <w:rPr>
-                  <w:rFonts w:ascii="Times New Roman" w:hAnsi="Times New Roman"/>
-                  <w:b/>
-                  <w:sz w:val="22"/>
-                </w:rPr>
-                <w:t xml:space="preserve"> </w:t>
-              </w:r>
-            </w:ins>
-            <w:r>
-              <w:rPr>
-                <w:rFonts w:ascii="Times New Roman" w:hAnsi="Times New Roman"/>
-                <w:b/>
-                <w:sz w:val="22"/>
-              </w:rPr>
-              <w:t>Manager</w:t>
+            </w:ins>
+            <w:r>
+              <w:rPr>
+                <w:rFonts w:ascii="Times New Roman" w:hAnsi="Times New Roman"/>
+                <w:b/>
+                <w:sz w:val="22"/>
+              </w:rPr>
+              <w:t xml:space="preserve"> Engineer</w:t>
             </w:r>
           </w:p>
         </w:tc>
@@ -4891,6 +6367,7 @@
             <w:pPr>
               <w:rPr>
                 <w:rFonts w:ascii="Times New Roman" w:hAnsi="Times New Roman"/>
+                <w:b/>
                 <w:sz w:val="22"/>
               </w:rPr>
             </w:pPr>
@@ -4905,27 +6382,47 @@
             <w:pPr>
               <w:pStyle w:val="ResumeBullet"/>
             </w:pPr>
-            <w:bookmarkStart w:id="227" w:name="cirrusManager"/>
-            <w:bookmarkEnd w:id="227"/>
+            <w:bookmarkStart w:id="297" w:name="researchPlanning"/>
+            <w:bookmarkEnd w:id="297"/>
             <w:r>
               <w:sym w:font="Symbol" w:char="F0B7"/>
             </w:r>
             <w:r>
-              <w:t xml:space="preserve">  Manage</w:t>
-            </w:r>
-            <w:ins w:id="228" w:author="Gentry, Mark" w:date="2024-08-18T13:12:00Z" w16du:dateUtc="2024-08-18T17:12:00Z">
-              <w:r>
-                <w:t>d</w:t>
-              </w:r>
-            </w:ins>
-            <w:r>
-              <w:t xml:space="preserve"> group responsible for implementation of new audio features on Crystal's DSP-based parts.  Features include DLS wave-table synthesis, 3D audio, four-channel support, EQ, and audio effects.  Group </w:t>
-            </w:r>
-            <w:r>
-              <w:t>wa</w:t>
-            </w:r>
-            <w:r>
-              <w:t>s also responsible for defining DSP resource (memory, MIPs) management policy.</w:t>
+              <w:t xml:space="preserve">  Compared implementations of signal processing algorithms on </w:t>
+            </w:r>
+            <w:del w:id="298" w:author="Gentry, Mark" w:date="2024-08-14T08:51:00Z" w16du:dateUtc="2024-08-14T12:51:00Z">
+              <w:r>
+                <w:delText xml:space="preserve">the </w:delText>
+              </w:r>
+            </w:del>
+            <w:r>
+              <w:t xml:space="preserve">“EMSP” </w:t>
+            </w:r>
+            <w:del w:id="299" w:author="Gentry, Mark" w:date="2024-08-24T13:01:00Z" w16du:dateUtc="2024-08-24T17:01:00Z">
+              <w:r>
+                <w:delText>hardware</w:delText>
+              </w:r>
+            </w:del>
+            <w:ins w:id="300" w:author="Gentry, Mark" w:date="2024-08-24T13:01:00Z" w16du:dateUtc="2024-08-24T17:01:00Z">
+              <w:r>
+                <w:t>HW</w:t>
+              </w:r>
+            </w:ins>
+            <w:r>
+              <w:t xml:space="preserve"> with C program or with differing </w:t>
+            </w:r>
+            <w:del w:id="301" w:author="Gentry, Mark" w:date="2024-08-24T13:01:00Z" w16du:dateUtc="2024-08-24T17:01:00Z">
+              <w:r>
+                <w:delText>hardware</w:delText>
+              </w:r>
+            </w:del>
+            <w:ins w:id="302" w:author="Gentry, Mark" w:date="2024-08-24T13:01:00Z" w16du:dateUtc="2024-08-24T17:01:00Z">
+              <w:r>
+                <w:t>HW</w:t>
+              </w:r>
+            </w:ins>
+            <w:r>
+              <w:t xml:space="preserve"> implementations.  Wrote UNIX scripts to automate this testing.</w:t>
             </w:r>
           </w:p>
         </w:tc>
@@ -4942,6 +6439,7 @@
             <w:pPr>
               <w:rPr>
                 <w:rFonts w:ascii="Times New Roman" w:hAnsi="Times New Roman"/>
+                <w:b/>
                 <w:sz w:val="22"/>
               </w:rPr>
             </w:pPr>
@@ -4956,34 +6454,117 @@
             <w:pPr>
               <w:pStyle w:val="ResumeBullet"/>
             </w:pPr>
-            <w:r>
-              <w:sym w:font="Symbol" w:char="F0B7"/>
-            </w:r>
-            <w:r>
-              <w:t xml:space="preserve">  </w:t>
-            </w:r>
-            <w:r>
-              <w:t>Develop</w:t>
-            </w:r>
-            <w:r>
-              <w:t>ed</w:t>
-            </w:r>
-            <w:r>
-              <w:t xml:space="preserve"> and manage</w:t>
-            </w:r>
-            <w:r>
-              <w:t>d</w:t>
-            </w:r>
-            <w:r>
-              <w:t xml:space="preserve"> development of Windows drivers (wave, mixer, MIDI, DirectSound) for PCI audio accelerators</w:t>
-            </w:r>
-            <w:del w:id="229" w:author="Gentry, Mark" w:date="2024-08-16T22:46:00Z" w16du:dateUtc="2024-08-17T02:46:00Z">
-              <w:r>
-                <w:delText>.  Majority of PCI device driver code common across Windows 95/98, Windows NT, and WDM</w:delText>
-              </w:r>
-            </w:del>
-            <w:r>
-              <w:t>.</w:t>
+          </w:p>
+        </w:tc>
+      </w:tr>
+      <w:tr>
+        <w:trPr>
+          <w:cantSplit/>
+        </w:trPr>
+        <w:tc>
+          <w:tcPr>
+            <w:tcW w:w="1862" w:type="dxa"/>
+            <w:gridSpan w:val="2"/>
+          </w:tcPr>
+          <w:p>
+            <w:pPr>
+              <w:rPr>
+                <w:rFonts w:ascii="Times New Roman" w:hAnsi="Times New Roman"/>
+                <w:sz w:val="22"/>
+              </w:rPr>
+            </w:pPr>
+            <w:r>
+              <w:rPr>
+                <w:rFonts w:ascii="Times New Roman" w:hAnsi="Times New Roman"/>
+                <w:b/>
+                <w:sz w:val="22"/>
+              </w:rPr>
+              <w:t>EDUCATION</w:t>
+            </w:r>
+          </w:p>
+        </w:tc>
+        <w:tc>
+          <w:tcPr>
+            <w:tcW w:w="7380" w:type="dxa"/>
+            <w:gridSpan w:val="2"/>
+          </w:tcPr>
+          <w:p>
+            <w:pPr>
+              <w:rPr>
+                <w:rFonts w:ascii="Times New Roman" w:hAnsi="Times New Roman"/>
+                <w:sz w:val="22"/>
+              </w:rPr>
+            </w:pPr>
+          </w:p>
+        </w:tc>
+      </w:tr>
+      <w:tr>
+        <w:trPr>
+          <w:cantSplit/>
+        </w:trPr>
+        <w:tc>
+          <w:tcPr>
+            <w:tcW w:w="1862" w:type="dxa"/>
+            <w:gridSpan w:val="2"/>
+          </w:tcPr>
+          <w:p>
+            <w:pPr>
+              <w:rPr>
+                <w:rFonts w:ascii="Times New Roman" w:hAnsi="Times New Roman"/>
+                <w:b/>
+                <w:sz w:val="22"/>
+              </w:rPr>
+            </w:pPr>
+            <w:r>
+              <w:rPr>
+                <w:rFonts w:ascii="Times New Roman" w:hAnsi="Times New Roman"/>
+                <w:b/>
+                <w:sz w:val="22"/>
+              </w:rPr>
+              <w:t>1990</w:t>
+            </w:r>
+          </w:p>
+          <w:p>
+            <w:pPr>
+              <w:rPr>
+                <w:rFonts w:ascii="Times New Roman" w:hAnsi="Times New Roman"/>
+                <w:b/>
+                <w:sz w:val="22"/>
+              </w:rPr>
+            </w:pPr>
+          </w:p>
+        </w:tc>
+        <w:tc>
+          <w:tcPr>
+            <w:tcW w:w="7380" w:type="dxa"/>
+            <w:gridSpan w:val="2"/>
+          </w:tcPr>
+          <w:p>
+            <w:pPr>
+              <w:rPr>
+                <w:rFonts w:ascii="Times New Roman" w:hAnsi="Times New Roman"/>
+                <w:b/>
+                <w:sz w:val="22"/>
+              </w:rPr>
+            </w:pPr>
+            <w:r>
+              <w:rPr>
+                <w:rFonts w:ascii="Times New Roman" w:hAnsi="Times New Roman"/>
+                <w:b/>
+                <w:sz w:val="22"/>
+              </w:rPr>
+              <w:t>GEORGIA INSTITUTE OF TECHNOLOGY</w:t>
+            </w:r>
+          </w:p>
+          <w:p>
+            <w:pPr>
+              <w:pStyle w:val="mynormal"/>
+              <w:rPr>
+                <w:b/>
+              </w:rPr>
+            </w:pPr>
+            <w:r>
+              <w:t>Atlanta, Georgia</w:t>
             </w:r>
           </w:p>
         </w:tc>
@@ -5014,39 +6595,37 @@
             <w:pPr>
               <w:pStyle w:val="ResumeBullet"/>
             </w:pPr>
+            <w:bookmarkStart w:id="303" w:name="georgiaTech"/>
+            <w:bookmarkEnd w:id="303"/>
             <w:r>
               <w:sym w:font="Symbol" w:char="F0B7"/>
             </w:r>
             <w:r>
-              <w:t xml:space="preserve">  </w:t>
-            </w:r>
-            <w:r>
-              <w:t>Developed DSP code for Crystal's proprietary DSP and help</w:t>
-            </w:r>
-            <w:ins w:id="230" w:author="Gentry, Mark" w:date="2024-08-18T13:13:00Z" w16du:dateUtc="2024-08-18T17:13:00Z">
-              <w:r>
-                <w:t>ed</w:t>
-              </w:r>
-            </w:ins>
-            <w:r>
-              <w:t xml:space="preserve"> define</w:t>
-            </w:r>
-            <w:del w:id="231" w:author="Gentry, Mark" w:date="2024-08-18T13:13:00Z" w16du:dateUtc="2024-08-18T17:13:00Z">
-              <w:r>
-                <w:delText>d</w:delText>
+              <w:t xml:space="preserve">  Graduated with </w:t>
+            </w:r>
+            <w:proofErr w:type="gramStart"/>
+            <w:r>
+              <w:t>Master's Degree in Electrical Engineering</w:t>
+            </w:r>
+            <w:proofErr w:type="gramEnd"/>
+            <w:r>
+              <w:t xml:space="preserve"> in December, 1990.  Maintained a GPA of 3.9/4.0 while working as a graduate teaching assistant</w:t>
+            </w:r>
+            <w:ins w:id="304" w:author="Gentry, Mark" w:date="2024-08-14T08:52:00Z" w16du:dateUtc="2024-08-14T12:52:00Z">
+              <w:r>
+                <w:t xml:space="preserve"> and </w:t>
+              </w:r>
+            </w:ins>
+            <w:ins w:id="305" w:author="Gentry, Mark" w:date="2024-08-14T08:53:00Z" w16du:dateUtc="2024-08-14T12:53:00Z">
+              <w:r>
+                <w:t>while holding two part-time jobs.</w:t>
+              </w:r>
+            </w:ins>
+            <w:del w:id="306" w:author="Gentry, Mark" w:date="2024-08-14T08:52:00Z" w16du:dateUtc="2024-08-14T12:52:00Z">
+              <w:r>
+                <w:delText>.</w:delText>
               </w:r>
             </w:del>
-            <w:r>
-              <w:t xml:space="preserve"> hardware architecture to make PCI audio parts compatible with DOS </w:t>
-            </w:r>
-            <w:ins w:id="232" w:author="Gentry, Mark" w:date="2024-08-14T08:41:00Z" w16du:dateUtc="2024-08-14T12:41:00Z">
-              <w:r>
-                <w:t xml:space="preserve">(legacy) </w:t>
-              </w:r>
-            </w:ins>
-            <w:r>
-              <w:t>games.</w:t>
-            </w:r>
           </w:p>
         </w:tc>
       </w:tr>
@@ -5080,52 +6659,24 @@
               <w:sym w:font="Symbol" w:char="F0B7"/>
             </w:r>
             <w:r>
-              <w:t xml:space="preserve">  Led effort to have PCI audio parts designed into embedded systems (auto, set-top). Wr</w:t>
-            </w:r>
-            <w:r>
-              <w:t>o</w:t>
-            </w:r>
-            <w:r>
-              <w:t>te specs, develop</w:t>
-            </w:r>
-            <w:r>
-              <w:t>ed</w:t>
-            </w:r>
-            <w:r>
-              <w:t xml:space="preserve"> sample code, and work</w:t>
-            </w:r>
-            <w:r>
-              <w:t>ed</w:t>
-            </w:r>
-            <w:r>
-              <w:t xml:space="preserve"> with customers </w:t>
-            </w:r>
-            <w:del w:id="233" w:author="Gentry, Mark" w:date="2024-08-14T08:41:00Z" w16du:dateUtc="2024-08-14T12:41:00Z">
-              <w:r>
-                <w:delText>in order to</w:delText>
+              <w:t xml:space="preserve">  Concentrated on digital signal processing, communication, and computer architecture courses.  Completed projects in speech and image processing</w:t>
+            </w:r>
+            <w:ins w:id="307" w:author="Gentry, Mark" w:date="2024-08-16T22:50:00Z" w16du:dateUtc="2024-08-17T02:50:00Z">
+              <w:r>
+                <w:t xml:space="preserve"> and </w:t>
+              </w:r>
+            </w:ins>
+            <w:del w:id="308" w:author="Gentry, Mark" w:date="2024-08-16T22:50:00Z" w16du:dateUtc="2024-08-17T02:50:00Z">
+              <w:r>
+                <w:delText xml:space="preserve">, </w:delText>
               </w:r>
             </w:del>
-            <w:ins w:id="234" w:author="Gentry, Mark" w:date="2024-08-14T08:41:00Z" w16du:dateUtc="2024-08-14T12:41:00Z">
-              <w:r>
-                <w:t>to</w:t>
-              </w:r>
-            </w:ins>
-            <w:r>
-              <w:t xml:space="preserve"> do this</w:t>
-            </w:r>
-            <w:del w:id="235" w:author="Gentry, Mark" w:date="2024-08-18T13:40:00Z" w16du:dateUtc="2024-08-18T17:40:00Z">
-              <w:r>
-                <w:delText xml:space="preserve">.  This same work </w:delText>
-              </w:r>
-            </w:del>
-            <w:del w:id="236" w:author="Gentry, Mark" w:date="2024-08-14T08:41:00Z" w16du:dateUtc="2024-08-14T12:41:00Z">
-              <w:r>
-                <w:delText xml:space="preserve">has </w:delText>
-              </w:r>
-            </w:del>
-            <w:del w:id="237" w:author="Gentry, Mark" w:date="2024-08-18T13:40:00Z" w16du:dateUtc="2024-08-18T17:40:00Z">
-              <w:r>
-                <w:delText>resulted in third parties being able to develop Linux drivers for Crystal PCI audio parts</w:delText>
+            <w:r>
+              <w:t>adaptive filtering</w:t>
+            </w:r>
+            <w:del w:id="309" w:author="Gentry, Mark" w:date="2024-08-16T22:50:00Z" w16du:dateUtc="2024-08-17T02:50:00Z">
+              <w:r>
+                <w:delText>, and computer architecture simulation</w:delText>
               </w:r>
             </w:del>
             <w:r>
@@ -5160,19 +6711,83 @@
             <w:pPr>
               <w:pStyle w:val="ResumeBullet"/>
             </w:pPr>
-            <w:r>
-              <w:sym w:font="Symbol" w:char="F0B7"/>
-            </w:r>
-            <w:r>
-              <w:t xml:space="preserve">  Developed and managed development of Windows drivers (wave, mixer, MIDI, DirectSound) for ISA CODECs</w:t>
-            </w:r>
-            <w:del w:id="238" w:author="Gentry, Mark" w:date="2024-08-16T22:46:00Z" w16du:dateUtc="2024-08-17T02:46:00Z">
-              <w:r>
-                <w:delText>. Also managed development of Windows NT and Windows 3.1 drivers for these products</w:delText>
-              </w:r>
-            </w:del>
-            <w:r>
-              <w:t>.</w:t>
+          </w:p>
+        </w:tc>
+      </w:tr>
+      <w:tr>
+        <w:trPr>
+          <w:cantSplit/>
+        </w:trPr>
+        <w:tc>
+          <w:tcPr>
+            <w:tcW w:w="1862" w:type="dxa"/>
+            <w:gridSpan w:val="2"/>
+          </w:tcPr>
+          <w:p>
+            <w:pPr>
+              <w:rPr>
+                <w:rFonts w:ascii="Times New Roman" w:hAnsi="Times New Roman"/>
+                <w:b/>
+                <w:sz w:val="22"/>
+              </w:rPr>
+            </w:pPr>
+            <w:r>
+              <w:rPr>
+                <w:rFonts w:ascii="Times New Roman" w:hAnsi="Times New Roman"/>
+                <w:b/>
+                <w:sz w:val="22"/>
+              </w:rPr>
+              <w:lastRenderedPageBreak/>
+              <w:t>1983</w:t>
+            </w:r>
+            <w:r>
+              <w:rPr>
+                <w:rFonts w:ascii="Times New Roman" w:hAnsi="Times New Roman"/>
+                <w:b/>
+                <w:sz w:val="22"/>
+              </w:rPr>
+              <w:noBreakHyphen/>
+              <w:t>1988</w:t>
+            </w:r>
+          </w:p>
+          <w:p>
+            <w:pPr>
+              <w:rPr>
+                <w:rFonts w:ascii="Times New Roman" w:hAnsi="Times New Roman"/>
+                <w:b/>
+                <w:sz w:val="22"/>
+              </w:rPr>
+            </w:pPr>
+          </w:p>
+        </w:tc>
+        <w:tc>
+          <w:tcPr>
+            <w:tcW w:w="7380" w:type="dxa"/>
+            <w:gridSpan w:val="2"/>
+          </w:tcPr>
+          <w:p>
+            <w:pPr>
+              <w:rPr>
+                <w:rFonts w:ascii="Times New Roman" w:hAnsi="Times New Roman"/>
+                <w:b/>
+                <w:sz w:val="22"/>
+              </w:rPr>
+            </w:pPr>
+            <w:r>
+              <w:rPr>
+                <w:rFonts w:ascii="Times New Roman" w:hAnsi="Times New Roman"/>
+                <w:b/>
+                <w:sz w:val="22"/>
+              </w:rPr>
+              <w:t>UNIVERSITY OF MARYLAND</w:t>
+            </w:r>
+          </w:p>
+          <w:p>
+            <w:pPr>
+              <w:pStyle w:val="mynormal"/>
+            </w:pPr>
+            <w:r>
+              <w:t>College Park, Maryland</w:t>
             </w:r>
           </w:p>
         </w:tc>
@@ -5189,6 +6804,7 @@
             <w:pPr>
               <w:rPr>
                 <w:rFonts w:ascii="Times New Roman" w:hAnsi="Times New Roman"/>
+                <w:b/>
                 <w:sz w:val="22"/>
               </w:rPr>
             </w:pPr>
@@ -5203,1364 +6819,8 @@
             <w:pPr>
               <w:pStyle w:val="ResumeBullet"/>
             </w:pPr>
-            <w:r>
-              <w:sym w:font="Symbol" w:char="F0B7"/>
-            </w:r>
-            <w:r>
-              <w:t xml:space="preserve">  Programming classes at University of Texas.</w:t>
-            </w:r>
-          </w:p>
-        </w:tc>
-      </w:tr>
-      <w:tr>
-        <w:trPr>
-          <w:cantSplit/>
-        </w:trPr>
-        <w:tc>
-          <w:tcPr>
-            <w:tcW w:w="782" w:type="dxa"/>
-          </w:tcPr>
-          <w:p>
-            <w:pPr>
-              <w:rPr>
-                <w:rFonts w:ascii="Times New Roman" w:hAnsi="Times New Roman"/>
-                <w:sz w:val="22"/>
-              </w:rPr>
-            </w:pPr>
-          </w:p>
-        </w:tc>
-        <w:tc>
-          <w:tcPr>
-            <w:tcW w:w="8460" w:type="dxa"/>
-            <w:gridSpan w:val="3"/>
-          </w:tcPr>
-          <w:p>
-            <w:pPr>
-              <w:pStyle w:val="ResumeBullet"/>
-            </w:pPr>
-          </w:p>
-        </w:tc>
-      </w:tr>
-      <w:tr>
-        <w:trPr>
-          <w:cantSplit/>
-        </w:trPr>
-        <w:tc>
-          <w:tcPr>
-            <w:tcW w:w="1862" w:type="dxa"/>
-            <w:gridSpan w:val="2"/>
-          </w:tcPr>
-          <w:p>
-            <w:pPr>
-              <w:rPr>
-                <w:rFonts w:ascii="Times New Roman" w:hAnsi="Times New Roman"/>
-                <w:b/>
-                <w:sz w:val="22"/>
-              </w:rPr>
-            </w:pPr>
-            <w:r>
-              <w:rPr>
-                <w:rFonts w:ascii="Times New Roman" w:hAnsi="Times New Roman"/>
-                <w:b/>
-                <w:sz w:val="22"/>
-              </w:rPr>
-              <w:t>1994 – 1996</w:t>
-            </w:r>
-          </w:p>
-        </w:tc>
-        <w:tc>
-          <w:tcPr>
-            <w:tcW w:w="7380" w:type="dxa"/>
-            <w:gridSpan w:val="2"/>
-          </w:tcPr>
-          <w:p>
-            <w:pPr>
-              <w:rPr>
-                <w:rFonts w:ascii="Times New Roman" w:hAnsi="Times New Roman"/>
-                <w:b/>
-                <w:sz w:val="22"/>
-              </w:rPr>
-            </w:pPr>
-            <w:r>
-              <w:rPr>
-                <w:rFonts w:ascii="Times New Roman" w:hAnsi="Times New Roman"/>
-                <w:b/>
-                <w:sz w:val="22"/>
-              </w:rPr>
-              <w:t xml:space="preserve">Embedded Audio </w:t>
-            </w:r>
-            <w:del w:id="239" w:author="Gentry, Mark" w:date="2024-08-21T08:23:00Z" w16du:dateUtc="2024-08-21T12:23:00Z">
-              <w:r>
-                <w:rPr>
-                  <w:rFonts w:ascii="Times New Roman" w:hAnsi="Times New Roman"/>
-                  <w:b/>
-                  <w:sz w:val="22"/>
-                </w:rPr>
-                <w:delText xml:space="preserve">Software </w:delText>
-              </w:r>
-            </w:del>
-            <w:ins w:id="240" w:author="Gentry, Mark" w:date="2024-08-21T08:23:00Z" w16du:dateUtc="2024-08-21T12:23:00Z">
-              <w:r>
-                <w:rPr>
-                  <w:rFonts w:ascii="Times New Roman" w:hAnsi="Times New Roman"/>
-                  <w:b/>
-                  <w:sz w:val="22"/>
-                </w:rPr>
-                <w:t>SW</w:t>
-              </w:r>
-              <w:r>
-                <w:rPr>
-                  <w:rFonts w:ascii="Times New Roman" w:hAnsi="Times New Roman"/>
-                  <w:b/>
-                  <w:sz w:val="22"/>
-                </w:rPr>
-                <w:t xml:space="preserve"> </w:t>
-              </w:r>
-            </w:ins>
-            <w:r>
-              <w:rPr>
-                <w:rFonts w:ascii="Times New Roman" w:hAnsi="Times New Roman"/>
-                <w:b/>
-                <w:sz w:val="22"/>
-              </w:rPr>
-              <w:t>Project Lead</w:t>
-            </w:r>
-          </w:p>
-        </w:tc>
-      </w:tr>
-      <w:tr>
-        <w:trPr>
-          <w:cantSplit/>
-        </w:trPr>
-        <w:tc>
-          <w:tcPr>
-            <w:tcW w:w="782" w:type="dxa"/>
-          </w:tcPr>
-          <w:p>
-            <w:pPr>
-              <w:rPr>
-                <w:rFonts w:ascii="Times New Roman" w:hAnsi="Times New Roman"/>
-                <w:sz w:val="22"/>
-              </w:rPr>
-            </w:pPr>
-          </w:p>
-        </w:tc>
-        <w:tc>
-          <w:tcPr>
-            <w:tcW w:w="8460" w:type="dxa"/>
-            <w:gridSpan w:val="3"/>
-          </w:tcPr>
-          <w:p>
-            <w:pPr>
-              <w:pStyle w:val="ResumeBullet"/>
-            </w:pPr>
-            <w:bookmarkStart w:id="241" w:name="cirrusLead"/>
-            <w:bookmarkEnd w:id="241"/>
-            <w:r>
-              <w:sym w:font="Symbol" w:char="F0B7"/>
-            </w:r>
-            <w:r>
-              <w:t xml:space="preserve">  Managed development of all 8052 firmware in CS4232, CS4236, CS423xB, and CS4235/9.  All these chips included 8052 cores, stereo audio codec, and ISA interface.  Worked closely with chip designers to determine size of patch RAM, deliver ROM code, and add features like mapping codec registers into 8052 SFR space.</w:t>
-            </w:r>
-          </w:p>
-        </w:tc>
-      </w:tr>
-      <w:tr>
-        <w:trPr>
-          <w:cantSplit/>
-        </w:trPr>
-        <w:tc>
-          <w:tcPr>
-            <w:tcW w:w="782" w:type="dxa"/>
-          </w:tcPr>
-          <w:p>
-            <w:pPr>
-              <w:rPr>
-                <w:rFonts w:ascii="Times New Roman" w:hAnsi="Times New Roman"/>
-                <w:sz w:val="22"/>
-              </w:rPr>
-            </w:pPr>
-          </w:p>
-        </w:tc>
-        <w:tc>
-          <w:tcPr>
-            <w:tcW w:w="8460" w:type="dxa"/>
-            <w:gridSpan w:val="3"/>
-          </w:tcPr>
-          <w:p>
-            <w:pPr>
-              <w:pStyle w:val="ResumeBullet"/>
-            </w:pPr>
-            <w:r>
-              <w:sym w:font="Symbol" w:char="F0B7"/>
-            </w:r>
-            <w:r>
-              <w:t xml:space="preserve">  Salvaged production CS4232 </w:t>
-            </w:r>
-            <w:del w:id="242" w:author="Gentry, Mark" w:date="2024-08-16T22:47:00Z" w16du:dateUtc="2024-08-17T02:47:00Z">
-              <w:r>
-                <w:delText xml:space="preserve">and CS4236 </w:delText>
-              </w:r>
-            </w:del>
-            <w:r>
-              <w:t>parts by working around hardware problems in firmware.</w:t>
-            </w:r>
-          </w:p>
-        </w:tc>
-      </w:tr>
-      <w:tr>
-        <w:trPr>
-          <w:cantSplit/>
-        </w:trPr>
-        <w:tc>
-          <w:tcPr>
-            <w:tcW w:w="782" w:type="dxa"/>
-          </w:tcPr>
-          <w:p>
-            <w:pPr>
-              <w:rPr>
-                <w:rFonts w:ascii="Times New Roman" w:hAnsi="Times New Roman"/>
-                <w:sz w:val="22"/>
-              </w:rPr>
-            </w:pPr>
-          </w:p>
-        </w:tc>
-        <w:tc>
-          <w:tcPr>
-            <w:tcW w:w="8460" w:type="dxa"/>
-            <w:gridSpan w:val="3"/>
-          </w:tcPr>
-          <w:p>
-            <w:pPr>
-              <w:pStyle w:val="ResumeBullet"/>
-            </w:pPr>
-          </w:p>
-        </w:tc>
-      </w:tr>
-      <w:tr>
-        <w:trPr>
-          <w:cantSplit/>
-        </w:trPr>
-        <w:tc>
-          <w:tcPr>
-            <w:tcW w:w="1862" w:type="dxa"/>
-            <w:gridSpan w:val="2"/>
-          </w:tcPr>
-          <w:p>
-            <w:pPr>
-              <w:rPr>
-                <w:rFonts w:ascii="Times New Roman" w:hAnsi="Times New Roman"/>
-                <w:b/>
-                <w:sz w:val="22"/>
-              </w:rPr>
-            </w:pPr>
-            <w:r>
-              <w:rPr>
-                <w:rFonts w:ascii="Times New Roman" w:hAnsi="Times New Roman"/>
-                <w:b/>
-                <w:sz w:val="22"/>
-              </w:rPr>
-              <w:br w:type="page"/>
-              <w:t>1992 – 1994</w:t>
-            </w:r>
-          </w:p>
-        </w:tc>
-        <w:tc>
-          <w:tcPr>
-            <w:tcW w:w="7380" w:type="dxa"/>
-            <w:gridSpan w:val="2"/>
-          </w:tcPr>
-          <w:p>
-            <w:pPr>
-              <w:rPr>
-                <w:rFonts w:ascii="Times New Roman" w:hAnsi="Times New Roman"/>
-                <w:b/>
-                <w:sz w:val="22"/>
-              </w:rPr>
-            </w:pPr>
-            <w:r>
-              <w:rPr>
-                <w:rFonts w:ascii="Times New Roman" w:hAnsi="Times New Roman"/>
-                <w:b/>
-                <w:sz w:val="22"/>
-              </w:rPr>
-              <w:t xml:space="preserve">Multimedia </w:t>
-            </w:r>
-            <w:del w:id="243" w:author="Gentry, Mark" w:date="2024-08-21T08:23:00Z" w16du:dateUtc="2024-08-21T12:23:00Z">
-              <w:r>
-                <w:rPr>
-                  <w:rFonts w:ascii="Times New Roman" w:hAnsi="Times New Roman"/>
-                  <w:b/>
-                  <w:sz w:val="22"/>
-                </w:rPr>
-                <w:delText xml:space="preserve">Software </w:delText>
-              </w:r>
-            </w:del>
-            <w:ins w:id="244" w:author="Gentry, Mark" w:date="2024-08-21T08:23:00Z" w16du:dateUtc="2024-08-21T12:23:00Z">
-              <w:r>
-                <w:rPr>
-                  <w:rFonts w:ascii="Times New Roman" w:hAnsi="Times New Roman"/>
-                  <w:b/>
-                  <w:sz w:val="22"/>
-                </w:rPr>
-                <w:t>SW</w:t>
-              </w:r>
-              <w:r>
-                <w:rPr>
-                  <w:rFonts w:ascii="Times New Roman" w:hAnsi="Times New Roman"/>
-                  <w:b/>
-                  <w:sz w:val="22"/>
-                </w:rPr>
-                <w:t xml:space="preserve"> </w:t>
-              </w:r>
-            </w:ins>
-            <w:r>
-              <w:rPr>
-                <w:rFonts w:ascii="Times New Roman" w:hAnsi="Times New Roman"/>
-                <w:b/>
-                <w:sz w:val="22"/>
-              </w:rPr>
-              <w:t>Engineer</w:t>
-            </w:r>
-          </w:p>
-        </w:tc>
-      </w:tr>
-      <w:tr>
-        <w:trPr>
-          <w:cantSplit/>
-        </w:trPr>
-        <w:tc>
-          <w:tcPr>
-            <w:tcW w:w="782" w:type="dxa"/>
-          </w:tcPr>
-          <w:p>
-            <w:pPr>
-              <w:rPr>
-                <w:rFonts w:ascii="Times New Roman" w:hAnsi="Times New Roman"/>
-                <w:sz w:val="22"/>
-              </w:rPr>
-            </w:pPr>
-          </w:p>
-        </w:tc>
-        <w:tc>
-          <w:tcPr>
-            <w:tcW w:w="8460" w:type="dxa"/>
-            <w:gridSpan w:val="3"/>
-          </w:tcPr>
-          <w:p>
-            <w:pPr>
-              <w:pStyle w:val="ResumeBullet"/>
-            </w:pPr>
-            <w:bookmarkStart w:id="245" w:name="cirrusEngineer"/>
-            <w:bookmarkEnd w:id="245"/>
-            <w:r>
-              <w:sym w:font="Symbol" w:char="F0B7"/>
-            </w:r>
-            <w:r>
-              <w:t xml:space="preserve">  Responsible for compatibility with hardware interfaces used by DOS games (SoundBlaster and MPU-401) on ISA parts and for Plug and Play and APM (advanced power management) compatibility on ISA parts. ISA parts include</w:t>
-            </w:r>
-            <w:r>
-              <w:t>d</w:t>
-            </w:r>
-            <w:r>
-              <w:t xml:space="preserve"> 8052 cores that execute</w:t>
-            </w:r>
-            <w:r>
-              <w:t>d</w:t>
-            </w:r>
-            <w:r>
-              <w:t xml:space="preserve"> code to provide this compatibility.  Developed this code and defined </w:t>
-            </w:r>
-            <w:ins w:id="246" w:author="Gentry, Mark" w:date="2024-08-14T08:46:00Z" w16du:dateUtc="2024-08-14T12:46:00Z">
-              <w:r>
-                <w:t xml:space="preserve">associated </w:t>
-              </w:r>
-            </w:ins>
-            <w:r>
-              <w:t>hardware/software architecture</w:t>
-            </w:r>
-            <w:del w:id="247" w:author="Gentry, Mark" w:date="2024-08-14T08:46:00Z" w16du:dateUtc="2024-08-14T12:46:00Z">
-              <w:r>
-                <w:delText xml:space="preserve"> required to do so</w:delText>
-              </w:r>
-            </w:del>
-            <w:r>
-              <w:t xml:space="preserve">.  Extensively reverse-engineered games </w:t>
-            </w:r>
-            <w:del w:id="248" w:author="Gentry, Mark" w:date="2024-08-18T13:14:00Z" w16du:dateUtc="2024-08-18T17:14:00Z">
-              <w:r>
-                <w:delText>in order to</w:delText>
-              </w:r>
-            </w:del>
-            <w:ins w:id="249" w:author="Gentry, Mark" w:date="2024-08-18T13:14:00Z" w16du:dateUtc="2024-08-18T17:14:00Z">
-              <w:r>
-                <w:t>to</w:t>
-              </w:r>
-            </w:ins>
-            <w:r>
-              <w:t xml:space="preserve"> implement required</w:t>
-            </w:r>
-            <w:ins w:id="250" w:author="Gentry, Mark" w:date="2024-08-14T08:47:00Z" w16du:dateUtc="2024-08-14T12:47:00Z">
-              <w:r>
-                <w:t>,</w:t>
-              </w:r>
-            </w:ins>
-            <w:r>
-              <w:t xml:space="preserve"> compatible hardware interfaces.</w:t>
-            </w:r>
-          </w:p>
-        </w:tc>
-      </w:tr>
-      <w:tr>
-        <w:trPr>
-          <w:cantSplit/>
-        </w:trPr>
-        <w:tc>
-          <w:tcPr>
-            <w:tcW w:w="782" w:type="dxa"/>
-          </w:tcPr>
-          <w:p>
-            <w:pPr>
-              <w:rPr>
-                <w:rFonts w:ascii="Times New Roman" w:hAnsi="Times New Roman"/>
-                <w:sz w:val="22"/>
-              </w:rPr>
-            </w:pPr>
-          </w:p>
-        </w:tc>
-        <w:tc>
-          <w:tcPr>
-            <w:tcW w:w="8460" w:type="dxa"/>
-            <w:gridSpan w:val="3"/>
-          </w:tcPr>
-          <w:p>
-            <w:pPr>
-              <w:pStyle w:val="ResumeBullet"/>
-            </w:pPr>
-            <w:r>
-              <w:sym w:font="Symbol" w:char="F0B7"/>
-            </w:r>
-            <w:r>
-              <w:t xml:space="preserve">  Defined interfaces between 8052 and ISA bus and 8052 and CODEC core on Crystal's ISA CODECs.</w:t>
-            </w:r>
-          </w:p>
-        </w:tc>
-      </w:tr>
-      <w:tr>
-        <w:trPr>
-          <w:cantSplit/>
-        </w:trPr>
-        <w:tc>
-          <w:tcPr>
-            <w:tcW w:w="782" w:type="dxa"/>
-          </w:tcPr>
-          <w:p>
-            <w:pPr>
-              <w:rPr>
-                <w:rFonts w:ascii="Times New Roman" w:hAnsi="Times New Roman"/>
-                <w:sz w:val="22"/>
-              </w:rPr>
-            </w:pPr>
-          </w:p>
-        </w:tc>
-        <w:tc>
-          <w:tcPr>
-            <w:tcW w:w="8460" w:type="dxa"/>
-            <w:gridSpan w:val="3"/>
-          </w:tcPr>
-          <w:p>
-            <w:pPr>
-              <w:pStyle w:val="ResumeBullet"/>
-            </w:pPr>
-            <w:r>
-              <w:sym w:font="Symbol" w:char="F0B7"/>
-            </w:r>
-            <w:r>
-              <w:t xml:space="preserve">  Wrote diagnostics software in C and x86 assembler for the CS4231 and CS4248. Software tests complete functionality, performance, and feature-sets of these parts and </w:t>
-            </w:r>
-            <w:ins w:id="251" w:author="Gentry, Mark" w:date="2024-08-18T13:14:00Z" w16du:dateUtc="2024-08-18T17:14:00Z">
-              <w:r>
-                <w:t xml:space="preserve">were </w:t>
-              </w:r>
-            </w:ins>
-            <w:del w:id="252" w:author="Gentry, Mark" w:date="2024-08-18T13:14:00Z" w16du:dateUtc="2024-08-18T17:14:00Z">
-              <w:r>
-                <w:delText xml:space="preserve">have been </w:delText>
-              </w:r>
-            </w:del>
-            <w:r>
-              <w:t>used extensively by Crystal chip and board designers as well as by Crystal customers.</w:t>
-            </w:r>
-          </w:p>
-        </w:tc>
-      </w:tr>
-      <w:tr>
-        <w:trPr>
-          <w:cantSplit/>
-        </w:trPr>
-        <w:tc>
-          <w:tcPr>
-            <w:tcW w:w="782" w:type="dxa"/>
-          </w:tcPr>
-          <w:p>
-            <w:pPr>
-              <w:rPr>
-                <w:rFonts w:ascii="Times New Roman" w:hAnsi="Times New Roman"/>
-                <w:sz w:val="22"/>
-              </w:rPr>
-            </w:pPr>
-          </w:p>
-        </w:tc>
-        <w:tc>
-          <w:tcPr>
-            <w:tcW w:w="8460" w:type="dxa"/>
-            <w:gridSpan w:val="3"/>
-          </w:tcPr>
-          <w:p>
-            <w:pPr>
-              <w:pStyle w:val="ResumeBullet"/>
-            </w:pPr>
-          </w:p>
-        </w:tc>
-      </w:tr>
-      <w:tr>
-        <w:trPr>
-          <w:cantSplit/>
-        </w:trPr>
-        <w:tc>
-          <w:tcPr>
-            <w:tcW w:w="1862" w:type="dxa"/>
-            <w:gridSpan w:val="2"/>
-          </w:tcPr>
-          <w:p>
-            <w:pPr>
-              <w:rPr>
-                <w:rFonts w:ascii="Times New Roman" w:hAnsi="Times New Roman"/>
-                <w:sz w:val="22"/>
-              </w:rPr>
-            </w:pPr>
-          </w:p>
-        </w:tc>
-        <w:tc>
-          <w:tcPr>
-            <w:tcW w:w="7380" w:type="dxa"/>
-            <w:gridSpan w:val="2"/>
-          </w:tcPr>
-          <w:p>
-            <w:pPr>
-              <w:rPr>
-                <w:rFonts w:ascii="Times New Roman" w:hAnsi="Times New Roman"/>
-                <w:b/>
-                <w:sz w:val="22"/>
-              </w:rPr>
-            </w:pPr>
-            <w:r>
-              <w:rPr>
-                <w:rFonts w:ascii="Times New Roman" w:hAnsi="Times New Roman"/>
-                <w:b/>
-                <w:sz w:val="22"/>
-              </w:rPr>
-              <w:t>COMPAQ COMPUTER CORPORATION</w:t>
-            </w:r>
-          </w:p>
-          <w:p>
-            <w:pPr>
-              <w:pStyle w:val="mynormal"/>
-              <w:rPr>
-                <w:b/>
-              </w:rPr>
-            </w:pPr>
-            <w:r>
-              <w:t>Houston, Texas</w:t>
-            </w:r>
-          </w:p>
-        </w:tc>
-      </w:tr>
-      <w:tr>
-        <w:trPr>
-          <w:cantSplit/>
-        </w:trPr>
-        <w:tc>
-          <w:tcPr>
-            <w:tcW w:w="1862" w:type="dxa"/>
-            <w:gridSpan w:val="2"/>
-          </w:tcPr>
-          <w:p>
-            <w:pPr>
-              <w:rPr>
-                <w:rFonts w:ascii="Times New Roman" w:hAnsi="Times New Roman"/>
-                <w:b/>
-                <w:sz w:val="22"/>
-              </w:rPr>
-            </w:pPr>
-            <w:r>
-              <w:rPr>
-                <w:rFonts w:ascii="Times New Roman" w:hAnsi="Times New Roman"/>
-                <w:b/>
-                <w:sz w:val="22"/>
-              </w:rPr>
-              <w:t>1991</w:t>
-            </w:r>
-            <w:r>
-              <w:rPr>
-                <w:rFonts w:ascii="Times New Roman" w:hAnsi="Times New Roman"/>
-                <w:b/>
-                <w:sz w:val="22"/>
-              </w:rPr>
-              <w:noBreakHyphen/>
-              <w:t>1992</w:t>
-            </w:r>
-          </w:p>
-          <w:p>
-            <w:pPr>
-              <w:rPr>
-                <w:rFonts w:ascii="Times New Roman" w:hAnsi="Times New Roman"/>
-                <w:b/>
-                <w:sz w:val="22"/>
-              </w:rPr>
-            </w:pPr>
-          </w:p>
-        </w:tc>
-        <w:tc>
-          <w:tcPr>
-            <w:tcW w:w="7380" w:type="dxa"/>
-            <w:gridSpan w:val="2"/>
-          </w:tcPr>
-          <w:p>
-            <w:pPr>
-              <w:rPr>
-                <w:rFonts w:ascii="Times New Roman" w:hAnsi="Times New Roman"/>
-                <w:b/>
-                <w:sz w:val="22"/>
-              </w:rPr>
-            </w:pPr>
-            <w:r>
-              <w:rPr>
-                <w:rFonts w:ascii="Times New Roman" w:hAnsi="Times New Roman"/>
-                <w:b/>
-                <w:sz w:val="22"/>
-              </w:rPr>
-              <w:t>Systems Engineer (Graphics Development)</w:t>
-            </w:r>
-          </w:p>
-        </w:tc>
-      </w:tr>
-      <w:tr>
-        <w:trPr>
-          <w:cantSplit/>
-        </w:trPr>
-        <w:tc>
-          <w:tcPr>
-            <w:tcW w:w="782" w:type="dxa"/>
-          </w:tcPr>
-          <w:p>
-            <w:pPr>
-              <w:rPr>
-                <w:rFonts w:ascii="Times New Roman" w:hAnsi="Times New Roman"/>
-                <w:sz w:val="22"/>
-              </w:rPr>
-            </w:pPr>
-          </w:p>
-        </w:tc>
-        <w:tc>
-          <w:tcPr>
-            <w:tcW w:w="8460" w:type="dxa"/>
-            <w:gridSpan w:val="3"/>
-          </w:tcPr>
-          <w:p>
-            <w:pPr>
-              <w:pStyle w:val="ResumeBullet"/>
-            </w:pPr>
-            <w:bookmarkStart w:id="253" w:name="compaq"/>
-            <w:bookmarkEnd w:id="253"/>
-            <w:r>
-              <w:sym w:font="Symbol" w:char="F0B7"/>
-            </w:r>
-            <w:r>
-              <w:t xml:space="preserve">  Used FPGAs for internal design projects. </w:t>
-            </w:r>
-            <w:del w:id="254" w:author="Gentry, Mark" w:date="2024-08-14T08:50:00Z" w16du:dateUtc="2024-08-14T12:50:00Z">
-              <w:r>
-                <w:delText xml:space="preserve"> Entered equations using ABEL and simulated with Verilog using FPGA and TTL models.  </w:delText>
-              </w:r>
-            </w:del>
-            <w:r>
-              <w:t>Designed EISA analysis board to be used for hardware and software profiling of graphics activity.  Partitioned design between MACH devices, standard TTL logic, and specialized logic.</w:t>
-            </w:r>
-          </w:p>
-        </w:tc>
-      </w:tr>
-      <w:tr>
-        <w:trPr>
-          <w:cantSplit/>
-        </w:trPr>
-        <w:tc>
-          <w:tcPr>
-            <w:tcW w:w="782" w:type="dxa"/>
-          </w:tcPr>
-          <w:p>
-            <w:pPr>
-              <w:rPr>
-                <w:rFonts w:ascii="Times New Roman" w:hAnsi="Times New Roman"/>
-                <w:sz w:val="22"/>
-              </w:rPr>
-            </w:pPr>
-          </w:p>
-        </w:tc>
-        <w:tc>
-          <w:tcPr>
-            <w:tcW w:w="8460" w:type="dxa"/>
-            <w:gridSpan w:val="3"/>
-          </w:tcPr>
-          <w:p>
-            <w:pPr>
-              <w:pStyle w:val="ResumeBullet"/>
-            </w:pPr>
-            <w:r>
-              <w:sym w:font="Symbol" w:char="F0B7"/>
-            </w:r>
-            <w:r>
-              <w:t xml:space="preserve">  Evaluated local-bus graphics architectures for 486 bus, VESA Local (VL) Bus, PCI, and Compaq host bus.</w:t>
-            </w:r>
-          </w:p>
-        </w:tc>
-      </w:tr>
-      <w:tr>
-        <w:trPr>
-          <w:cantSplit/>
-        </w:trPr>
-        <w:tc>
-          <w:tcPr>
-            <w:tcW w:w="782" w:type="dxa"/>
-          </w:tcPr>
-          <w:p>
-            <w:pPr>
-              <w:rPr>
-                <w:rFonts w:ascii="Times New Roman" w:hAnsi="Times New Roman"/>
-                <w:sz w:val="22"/>
-              </w:rPr>
-            </w:pPr>
-          </w:p>
-        </w:tc>
-        <w:tc>
-          <w:tcPr>
-            <w:tcW w:w="8460" w:type="dxa"/>
-            <w:gridSpan w:val="3"/>
-          </w:tcPr>
-          <w:p>
-            <w:pPr>
-              <w:pStyle w:val="ResumeBullet"/>
-            </w:pPr>
-            <w:r>
-              <w:sym w:font="Symbol" w:char="F0B7"/>
-            </w:r>
-            <w:r>
-              <w:t xml:space="preserve">  Designed simple audio circuits using Analog Devices A/D and D/A converters and wrote required low-level software while working on Business Audio project.</w:t>
-            </w:r>
-          </w:p>
-        </w:tc>
-      </w:tr>
-      <w:tr>
-        <w:trPr>
-          <w:cantSplit/>
-        </w:trPr>
-        <w:tc>
-          <w:tcPr>
-            <w:tcW w:w="782" w:type="dxa"/>
-          </w:tcPr>
-          <w:p>
-            <w:pPr>
-              <w:rPr>
-                <w:rFonts w:ascii="Times New Roman" w:hAnsi="Times New Roman"/>
-                <w:sz w:val="22"/>
-              </w:rPr>
-            </w:pPr>
-          </w:p>
-        </w:tc>
-        <w:tc>
-          <w:tcPr>
-            <w:tcW w:w="8460" w:type="dxa"/>
-            <w:gridSpan w:val="3"/>
-          </w:tcPr>
-          <w:p>
-            <w:pPr>
-              <w:pStyle w:val="ResumeBullet"/>
-            </w:pPr>
-          </w:p>
-        </w:tc>
-      </w:tr>
-      <w:tr>
-        <w:trPr>
-          <w:cantSplit/>
-        </w:trPr>
-        <w:tc>
-          <w:tcPr>
-            <w:tcW w:w="782" w:type="dxa"/>
-          </w:tcPr>
-          <w:p>
-            <w:pPr>
-              <w:rPr>
-                <w:rFonts w:ascii="Times New Roman" w:hAnsi="Times New Roman"/>
-                <w:sz w:val="22"/>
-              </w:rPr>
-            </w:pPr>
-          </w:p>
-        </w:tc>
-        <w:tc>
-          <w:tcPr>
-            <w:tcW w:w="1080" w:type="dxa"/>
-          </w:tcPr>
-          <w:p>
-            <w:pPr>
-              <w:rPr>
-                <w:rFonts w:ascii="Times New Roman" w:hAnsi="Times New Roman"/>
-                <w:b/>
-                <w:sz w:val="22"/>
-              </w:rPr>
-            </w:pPr>
-          </w:p>
-        </w:tc>
-        <w:tc>
-          <w:tcPr>
-            <w:tcW w:w="7380" w:type="dxa"/>
-            <w:gridSpan w:val="2"/>
-          </w:tcPr>
-          <w:p>
-            <w:pPr>
-              <w:rPr>
-                <w:rFonts w:ascii="Times New Roman" w:hAnsi="Times New Roman"/>
-                <w:b/>
-                <w:sz w:val="22"/>
-              </w:rPr>
-            </w:pPr>
-            <w:r>
-              <w:rPr>
-                <w:rFonts w:ascii="Times New Roman" w:hAnsi="Times New Roman"/>
-                <w:b/>
-                <w:sz w:val="22"/>
-              </w:rPr>
-              <w:t>RESEARCH PLANNING INC.</w:t>
-            </w:r>
-          </w:p>
-          <w:p>
-            <w:pPr>
-              <w:pStyle w:val="mynormal"/>
-              <w:rPr>
-                <w:b/>
-              </w:rPr>
-            </w:pPr>
-            <w:r>
-              <w:t>Arlington, Virginia</w:t>
-            </w:r>
-          </w:p>
-        </w:tc>
-      </w:tr>
-      <w:tr>
-        <w:trPr>
-          <w:cantSplit/>
-        </w:trPr>
-        <w:tc>
-          <w:tcPr>
-            <w:tcW w:w="782" w:type="dxa"/>
-          </w:tcPr>
-          <w:p>
-            <w:pPr>
-              <w:rPr>
-                <w:rFonts w:ascii="Times New Roman" w:hAnsi="Times New Roman"/>
-                <w:b/>
-                <w:sz w:val="22"/>
-              </w:rPr>
-            </w:pPr>
-            <w:r>
-              <w:rPr>
-                <w:rFonts w:ascii="Times New Roman" w:hAnsi="Times New Roman"/>
-                <w:b/>
-                <w:sz w:val="22"/>
-              </w:rPr>
-              <w:t>1989</w:t>
-            </w:r>
-          </w:p>
-        </w:tc>
-        <w:tc>
-          <w:tcPr>
-            <w:tcW w:w="1080" w:type="dxa"/>
-          </w:tcPr>
-          <w:p>
-            <w:pPr>
-              <w:rPr>
-                <w:rFonts w:ascii="Times New Roman" w:hAnsi="Times New Roman"/>
-                <w:b/>
-                <w:sz w:val="22"/>
-              </w:rPr>
-            </w:pPr>
-          </w:p>
-        </w:tc>
-        <w:tc>
-          <w:tcPr>
-            <w:tcW w:w="7380" w:type="dxa"/>
-            <w:gridSpan w:val="2"/>
-          </w:tcPr>
-          <w:p>
-            <w:pPr>
-              <w:rPr>
-                <w:rFonts w:ascii="Times New Roman" w:hAnsi="Times New Roman"/>
-                <w:b/>
-                <w:sz w:val="22"/>
-              </w:rPr>
-            </w:pPr>
-            <w:r>
-              <w:rPr>
-                <w:rFonts w:ascii="Times New Roman" w:hAnsi="Times New Roman"/>
-                <w:b/>
-                <w:sz w:val="22"/>
-              </w:rPr>
-              <w:t>Software Engineer</w:t>
-            </w:r>
-          </w:p>
-        </w:tc>
-      </w:tr>
-      <w:tr>
-        <w:trPr>
-          <w:cantSplit/>
-        </w:trPr>
-        <w:tc>
-          <w:tcPr>
-            <w:tcW w:w="782" w:type="dxa"/>
-          </w:tcPr>
-          <w:p>
-            <w:pPr>
-              <w:rPr>
-                <w:rFonts w:ascii="Times New Roman" w:hAnsi="Times New Roman"/>
-                <w:b/>
-                <w:sz w:val="22"/>
-              </w:rPr>
-            </w:pPr>
-          </w:p>
-        </w:tc>
-        <w:tc>
-          <w:tcPr>
-            <w:tcW w:w="8460" w:type="dxa"/>
-            <w:gridSpan w:val="3"/>
-          </w:tcPr>
-          <w:p>
-            <w:pPr>
-              <w:pStyle w:val="ResumeBullet"/>
-            </w:pPr>
-            <w:bookmarkStart w:id="255" w:name="researchPlanning"/>
-            <w:bookmarkEnd w:id="255"/>
-            <w:r>
-              <w:sym w:font="Symbol" w:char="F0B7"/>
-            </w:r>
-            <w:r>
-              <w:t xml:space="preserve">  Compared implementations of signal processing algorithms on </w:t>
-            </w:r>
-            <w:del w:id="256" w:author="Gentry, Mark" w:date="2024-08-14T08:51:00Z" w16du:dateUtc="2024-08-14T12:51:00Z">
-              <w:r>
-                <w:delText xml:space="preserve">the </w:delText>
-              </w:r>
-            </w:del>
-            <w:r>
-              <w:t xml:space="preserve">“EMSP” </w:t>
-            </w:r>
-            <w:r>
-              <w:t>hardware with C program or with differing hardware implementations.  Wrote UNIX scripts to automate this testing.</w:t>
-            </w:r>
-          </w:p>
-        </w:tc>
-      </w:tr>
-      <w:tr>
-        <w:trPr>
-          <w:cantSplit/>
-        </w:trPr>
-        <w:tc>
-          <w:tcPr>
-            <w:tcW w:w="782" w:type="dxa"/>
-          </w:tcPr>
-          <w:p>
-            <w:pPr>
-              <w:rPr>
-                <w:rFonts w:ascii="Times New Roman" w:hAnsi="Times New Roman"/>
-                <w:b/>
-                <w:sz w:val="22"/>
-              </w:rPr>
-            </w:pPr>
-          </w:p>
-        </w:tc>
-        <w:tc>
-          <w:tcPr>
-            <w:tcW w:w="8460" w:type="dxa"/>
-            <w:gridSpan w:val="3"/>
-          </w:tcPr>
-          <w:p>
-            <w:pPr>
-              <w:pStyle w:val="ResumeBullet"/>
-            </w:pPr>
-          </w:p>
-        </w:tc>
-      </w:tr>
-      <w:tr>
-        <w:trPr>
-          <w:cantSplit/>
-        </w:trPr>
-        <w:tc>
-          <w:tcPr>
-            <w:tcW w:w="1862" w:type="dxa"/>
-            <w:gridSpan w:val="2"/>
-          </w:tcPr>
-          <w:p>
-            <w:pPr>
-              <w:rPr>
-                <w:rFonts w:ascii="Times New Roman" w:hAnsi="Times New Roman"/>
-                <w:sz w:val="22"/>
-              </w:rPr>
-            </w:pPr>
-            <w:r>
-              <w:rPr>
-                <w:rFonts w:ascii="Times New Roman" w:hAnsi="Times New Roman"/>
-                <w:b/>
-                <w:sz w:val="22"/>
-              </w:rPr>
-              <w:t>EDUCATION</w:t>
-            </w:r>
-          </w:p>
-        </w:tc>
-        <w:tc>
-          <w:tcPr>
-            <w:tcW w:w="7380" w:type="dxa"/>
-            <w:gridSpan w:val="2"/>
-          </w:tcPr>
-          <w:p>
-            <w:pPr>
-              <w:rPr>
-                <w:rFonts w:ascii="Times New Roman" w:hAnsi="Times New Roman"/>
-                <w:sz w:val="22"/>
-              </w:rPr>
-            </w:pPr>
-          </w:p>
-        </w:tc>
-      </w:tr>
-      <w:tr>
-        <w:trPr>
-          <w:cantSplit/>
-        </w:trPr>
-        <w:tc>
-          <w:tcPr>
-            <w:tcW w:w="1862" w:type="dxa"/>
-            <w:gridSpan w:val="2"/>
-          </w:tcPr>
-          <w:p>
-            <w:pPr>
-              <w:rPr>
-                <w:rFonts w:ascii="Times New Roman" w:hAnsi="Times New Roman"/>
-                <w:b/>
-                <w:sz w:val="22"/>
-              </w:rPr>
-            </w:pPr>
-            <w:r>
-              <w:rPr>
-                <w:rFonts w:ascii="Times New Roman" w:hAnsi="Times New Roman"/>
-                <w:b/>
-                <w:sz w:val="22"/>
-              </w:rPr>
-              <w:t>1990</w:t>
-            </w:r>
-          </w:p>
-          <w:p>
-            <w:pPr>
-              <w:rPr>
-                <w:rFonts w:ascii="Times New Roman" w:hAnsi="Times New Roman"/>
-                <w:b/>
-                <w:sz w:val="22"/>
-              </w:rPr>
-            </w:pPr>
-          </w:p>
-        </w:tc>
-        <w:tc>
-          <w:tcPr>
-            <w:tcW w:w="7380" w:type="dxa"/>
-            <w:gridSpan w:val="2"/>
-          </w:tcPr>
-          <w:p>
-            <w:pPr>
-              <w:rPr>
-                <w:rFonts w:ascii="Times New Roman" w:hAnsi="Times New Roman"/>
-                <w:b/>
-                <w:sz w:val="22"/>
-              </w:rPr>
-            </w:pPr>
-            <w:r>
-              <w:rPr>
-                <w:rFonts w:ascii="Times New Roman" w:hAnsi="Times New Roman"/>
-                <w:b/>
-                <w:sz w:val="22"/>
-              </w:rPr>
-              <w:t>GEORGIA INSTITUTE OF TECHNOLOGY</w:t>
-            </w:r>
-          </w:p>
-          <w:p>
-            <w:pPr>
-              <w:pStyle w:val="mynormal"/>
-              <w:rPr>
-                <w:b/>
-              </w:rPr>
-            </w:pPr>
-            <w:r>
-              <w:t>Atlanta, Georgia</w:t>
-            </w:r>
-          </w:p>
-        </w:tc>
-      </w:tr>
-      <w:tr>
-        <w:trPr>
-          <w:cantSplit/>
-        </w:trPr>
-        <w:tc>
-          <w:tcPr>
-            <w:tcW w:w="782" w:type="dxa"/>
-          </w:tcPr>
-          <w:p>
-            <w:pPr>
-              <w:rPr>
-                <w:rFonts w:ascii="Times New Roman" w:hAnsi="Times New Roman"/>
-                <w:sz w:val="22"/>
-              </w:rPr>
-            </w:pPr>
-          </w:p>
-        </w:tc>
-        <w:tc>
-          <w:tcPr>
-            <w:tcW w:w="8460" w:type="dxa"/>
-            <w:gridSpan w:val="3"/>
-          </w:tcPr>
-          <w:p>
-            <w:pPr>
-              <w:pStyle w:val="ResumeBullet"/>
-            </w:pPr>
-            <w:bookmarkStart w:id="257" w:name="georgiaTech"/>
-            <w:bookmarkEnd w:id="257"/>
-            <w:r>
-              <w:sym w:font="Symbol" w:char="F0B7"/>
-            </w:r>
-            <w:r>
-              <w:t xml:space="preserve">  Graduated with </w:t>
-            </w:r>
-            <w:proofErr w:type="gramStart"/>
-            <w:r>
-              <w:t>Master's Degree in Electrical Engineering</w:t>
-            </w:r>
-            <w:proofErr w:type="gramEnd"/>
-            <w:r>
-              <w:t xml:space="preserve"> in December, 1990.  Maintained a GPA of 3.9/4.0 while working as a graduate teaching assistant</w:t>
-            </w:r>
-            <w:ins w:id="258" w:author="Gentry, Mark" w:date="2024-08-14T08:52:00Z" w16du:dateUtc="2024-08-14T12:52:00Z">
-              <w:r>
-                <w:t xml:space="preserve"> and </w:t>
-              </w:r>
-            </w:ins>
-            <w:ins w:id="259" w:author="Gentry, Mark" w:date="2024-08-14T08:53:00Z" w16du:dateUtc="2024-08-14T12:53:00Z">
-              <w:r>
-                <w:t>while holding two part-time jobs.</w:t>
-              </w:r>
-            </w:ins>
-            <w:del w:id="260" w:author="Gentry, Mark" w:date="2024-08-14T08:52:00Z" w16du:dateUtc="2024-08-14T12:52:00Z">
-              <w:r>
-                <w:delText>.</w:delText>
-              </w:r>
-            </w:del>
-          </w:p>
-        </w:tc>
-      </w:tr>
-      <w:tr>
-        <w:trPr>
-          <w:cantSplit/>
-        </w:trPr>
-        <w:tc>
-          <w:tcPr>
-            <w:tcW w:w="782" w:type="dxa"/>
-          </w:tcPr>
-          <w:p>
-            <w:pPr>
-              <w:rPr>
-                <w:rFonts w:ascii="Times New Roman" w:hAnsi="Times New Roman"/>
-                <w:sz w:val="22"/>
-              </w:rPr>
-            </w:pPr>
-          </w:p>
-        </w:tc>
-        <w:tc>
-          <w:tcPr>
-            <w:tcW w:w="8460" w:type="dxa"/>
-            <w:gridSpan w:val="3"/>
-          </w:tcPr>
-          <w:p>
-            <w:pPr>
-              <w:pStyle w:val="ResumeBullet"/>
-            </w:pPr>
-            <w:r>
-              <w:sym w:font="Symbol" w:char="F0B7"/>
-            </w:r>
-            <w:r>
-              <w:t xml:space="preserve">  Concentrated on digital signal processing, communication, and computer architecture courses.  Completed projects in speech and image processing</w:t>
-            </w:r>
-            <w:ins w:id="261" w:author="Gentry, Mark" w:date="2024-08-16T22:50:00Z" w16du:dateUtc="2024-08-17T02:50:00Z">
-              <w:r>
-                <w:t xml:space="preserve"> and </w:t>
-              </w:r>
-            </w:ins>
-            <w:del w:id="262" w:author="Gentry, Mark" w:date="2024-08-16T22:50:00Z" w16du:dateUtc="2024-08-17T02:50:00Z">
-              <w:r>
-                <w:delText xml:space="preserve">, </w:delText>
-              </w:r>
-            </w:del>
-            <w:r>
-              <w:t>adaptive filtering</w:t>
-            </w:r>
-            <w:del w:id="263" w:author="Gentry, Mark" w:date="2024-08-16T22:50:00Z" w16du:dateUtc="2024-08-17T02:50:00Z">
-              <w:r>
-                <w:delText>, and computer architecture simulation</w:delText>
-              </w:r>
-            </w:del>
-            <w:r>
-              <w:t>.</w:t>
-            </w:r>
-          </w:p>
-        </w:tc>
-      </w:tr>
-      <w:tr>
-        <w:trPr>
-          <w:cantSplit/>
-        </w:trPr>
-        <w:tc>
-          <w:tcPr>
-            <w:tcW w:w="782" w:type="dxa"/>
-          </w:tcPr>
-          <w:p>
-            <w:pPr>
-              <w:rPr>
-                <w:rFonts w:ascii="Times New Roman" w:hAnsi="Times New Roman"/>
-                <w:sz w:val="22"/>
-              </w:rPr>
-            </w:pPr>
-          </w:p>
-        </w:tc>
-        <w:tc>
-          <w:tcPr>
-            <w:tcW w:w="8460" w:type="dxa"/>
-            <w:gridSpan w:val="3"/>
-          </w:tcPr>
-          <w:p>
-            <w:pPr>
-              <w:pStyle w:val="ResumeBullet"/>
-            </w:pPr>
-          </w:p>
-        </w:tc>
-      </w:tr>
-      <w:tr>
-        <w:trPr>
-          <w:cantSplit/>
-        </w:trPr>
-        <w:tc>
-          <w:tcPr>
-            <w:tcW w:w="1862" w:type="dxa"/>
-            <w:gridSpan w:val="2"/>
-          </w:tcPr>
-          <w:p>
-            <w:pPr>
-              <w:rPr>
-                <w:rFonts w:ascii="Times New Roman" w:hAnsi="Times New Roman"/>
-                <w:b/>
-                <w:sz w:val="22"/>
-              </w:rPr>
-            </w:pPr>
-            <w:r>
-              <w:rPr>
-                <w:rFonts w:ascii="Times New Roman" w:hAnsi="Times New Roman"/>
-                <w:b/>
-                <w:sz w:val="22"/>
-              </w:rPr>
-              <w:t>1983</w:t>
-            </w:r>
-            <w:r>
-              <w:rPr>
-                <w:rFonts w:ascii="Times New Roman" w:hAnsi="Times New Roman"/>
-                <w:b/>
-                <w:sz w:val="22"/>
-              </w:rPr>
-              <w:noBreakHyphen/>
-              <w:t>1988</w:t>
-            </w:r>
-          </w:p>
-          <w:p>
-            <w:pPr>
-              <w:rPr>
-                <w:rFonts w:ascii="Times New Roman" w:hAnsi="Times New Roman"/>
-                <w:b/>
-                <w:sz w:val="22"/>
-              </w:rPr>
-            </w:pPr>
-          </w:p>
-        </w:tc>
-        <w:tc>
-          <w:tcPr>
-            <w:tcW w:w="7380" w:type="dxa"/>
-            <w:gridSpan w:val="2"/>
-          </w:tcPr>
-          <w:p>
-            <w:pPr>
-              <w:rPr>
-                <w:rFonts w:ascii="Times New Roman" w:hAnsi="Times New Roman"/>
-                <w:b/>
-                <w:sz w:val="22"/>
-              </w:rPr>
-            </w:pPr>
-            <w:r>
-              <w:rPr>
-                <w:rFonts w:ascii="Times New Roman" w:hAnsi="Times New Roman"/>
-                <w:b/>
-                <w:sz w:val="22"/>
-              </w:rPr>
-              <w:t>UNIVERSITY OF MARYLAND</w:t>
-            </w:r>
-          </w:p>
-          <w:p>
-            <w:pPr>
-              <w:pStyle w:val="mynormal"/>
-            </w:pPr>
-            <w:r>
-              <w:t>College Park, Maryland</w:t>
-            </w:r>
-          </w:p>
-        </w:tc>
-      </w:tr>
-      <w:tr>
-        <w:trPr>
-          <w:cantSplit/>
-        </w:trPr>
-        <w:tc>
-          <w:tcPr>
-            <w:tcW w:w="782" w:type="dxa"/>
-          </w:tcPr>
-          <w:p>
-            <w:pPr>
-              <w:rPr>
-                <w:rFonts w:ascii="Times New Roman" w:hAnsi="Times New Roman"/>
-                <w:b/>
-                <w:sz w:val="22"/>
-              </w:rPr>
-            </w:pPr>
-          </w:p>
-        </w:tc>
-        <w:tc>
-          <w:tcPr>
-            <w:tcW w:w="8460" w:type="dxa"/>
-            <w:gridSpan w:val="3"/>
-          </w:tcPr>
-          <w:p>
-            <w:pPr>
-              <w:pStyle w:val="ResumeBullet"/>
-            </w:pPr>
-            <w:bookmarkStart w:id="264" w:name="maryland"/>
-            <w:bookmarkEnd w:id="264"/>
+            <w:bookmarkStart w:id="310" w:name="maryland"/>
+            <w:bookmarkEnd w:id="310"/>
             <w:r>
               <w:sym w:font="Symbol" w:char="F0B7"/>
             </w:r>
@@ -6708,7 +6968,7 @@
       </w:r>
     </w:p>
   </w:comment>
-  <w:comment w:id="23" w:author="Gentry, Mark" w:date="2024-08-10T09:42:00Z" w:initials="GM">
+  <w:comment w:id="24" w:author="Gentry, Mark" w:date="2024-08-10T09:42:00Z" w:initials="GM">
     <w:p>
       <w:pPr>
         <w:pStyle w:val="CommentText"/>
@@ -6724,7 +6984,7 @@
       </w:r>
     </w:p>
   </w:comment>
-  <w:comment w:id="22" w:author="Gentry, Mark" w:date="2024-08-10T09:45:00Z" w:initials="GM">
+  <w:comment w:id="23" w:author="Gentry, Mark" w:date="2024-08-10T09:45:00Z" w:initials="GM">
     <w:p>
       <w:pPr>
         <w:pStyle w:val="CommentText"/>
@@ -6813,7 +7073,7 @@
 
 <file path=word/footer1.xml><?xml version="1.0" encoding="utf-8"?>
 <w:ftr xmlns:wpc="http://schemas.microsoft.com/office/word/2010/wordprocessingCanvas" xmlns:cx="http://schemas.microsoft.com/office/drawing/2014/chartex" xmlns:cx1="http://schemas.microsoft.com/office/drawing/2015/9/8/chartex" xmlns:cx2="http://schemas.microsoft.com/office/drawing/2015/10/21/chartex" xmlns:cx3="http://schemas.microsoft.com/office/drawing/2016/5/9/chartex" xmlns:cx4="http://schemas.microsoft.com/office/drawing/2016/5/10/chartex" xmlns:cx5="http://schemas.microsoft.com/office/drawing/2016/5/11/chartex" xmlns:cx6="http://schemas.microsoft.com/office/drawing/2016/5/12/chartex" xmlns:cx7="http://schemas.microsoft.com/office/drawing/2016/5/13/chartex" xmlns:cx8="http://schemas.microsoft.com/office/drawing/2016/5/14/chartex" xmlns:mc="http://schemas.openxmlformats.org/markup-compatibility/2006" xmlns:aink="http://schemas.microsoft.com/office/drawing/2016/ink" xmlns:am3d="http://schemas.microsoft.com/office/drawing/2017/model3d" xmlns:o="urn:schemas-microsoft-com:office:office" xmlns:oel="http://schemas.microsoft.com/office/2019/extlst" xmlns:r="http://schemas.openxmlformats.org/officeDocument/2006/relationships" xmlns:m="http://schemas.openxmlformats.org/officeDocument/2006/math" xmlns:v="urn:schemas-microsoft-com:vml" xmlns:wp14="http://schemas.microsoft.com/office/word/2010/wordprocessingDrawing" xmlns:wp="http://schemas.openxmlformats.org/drawingml/2006/wordprocessingDrawing" xmlns:w10="urn:schemas-microsoft-com:office:word" xmlns:w="http://schemas.openxmlformats.org/wordprocessingml/2006/main" xmlns:w14="http://schemas.microsoft.com/office/word/2010/wordml" xmlns:w15="http://schemas.microsoft.com/office/word/2012/wordml" xmlns:w16cex="http://schemas.microsoft.com/office/word/2018/wordml/cex" xmlns:w16cid="http://schemas.microsoft.com/office/word/2016/wordml/cid" xmlns:w16="http://schemas.microsoft.com/office/word/2018/wordml" xmlns:w16du="http://schemas.microsoft.com/office/word/2023/wordml/word16du" xmlns:w16sdtdh="http://schemas.microsoft.com/office/word/2020/wordml/sdtdatahash" xmlns:w16se="http://schemas.microsoft.com/office/word/2015/wordml/symex" xmlns:wpg="http://schemas.microsoft.com/office/word/2010/wordprocessingGroup" xmlns:wpi="http://schemas.microsoft.com/office/word/2010/wordprocessingInk" xmlns:wne="http://schemas.microsoft.com/office/word/2006/wordml" xmlns:wps="http://schemas.microsoft.com/office/word/2010/wordprocessingShape" mc:Ignorable="w14 w15 w16se w16cid w16 w16cex w16sdtdh w16du wp14">
-  <w:customXmlInsRangeStart w:id="265" w:author="Gentry, Mark" w:date="2024-08-16T22:53:00Z"/>
+  <w:customXmlInsRangeStart w:id="311" w:author="Gentry, Mark" w:date="2024-08-16T22:53:00Z"/>
   <w:sdt>
     <w:sdtPr>
       <w:id w:val="-1819495201"/>
@@ -6828,15 +7088,15 @@
       </w:rPr>
     </w:sdtEndPr>
     <w:sdtContent>
-      <w:customXmlInsRangeEnd w:id="265"/>
+      <w:customXmlInsRangeEnd w:id="311"/>
       <w:p>
         <w:pPr>
           <w:pStyle w:val="Footer"/>
           <w:rPr>
-            <w:ins w:id="266" w:author="Gentry, Mark" w:date="2024-08-16T22:53:00Z" w16du:dateUtc="2024-08-17T02:53:00Z"/>
+            <w:ins w:id="312" w:author="Gentry, Mark" w:date="2024-08-16T22:53:00Z" w16du:dateUtc="2024-08-17T02:53:00Z"/>
           </w:rPr>
         </w:pPr>
-        <w:ins w:id="267" w:author="Gentry, Mark" w:date="2024-08-16T22:53:00Z" w16du:dateUtc="2024-08-17T02:53:00Z">
+        <w:ins w:id="313" w:author="Gentry, Mark" w:date="2024-08-16T22:53:00Z" w16du:dateUtc="2024-08-17T02:53:00Z">
           <w:r>
             <w:fldChar w:fldCharType="begin"/>
           </w:r>
@@ -6859,7 +7119,7 @@
             <w:fldChar w:fldCharType="end"/>
           </w:r>
         </w:ins>
-        <w:ins w:id="268" w:author="Gentry, Mark" w:date="2024-08-16T22:54:00Z" w16du:dateUtc="2024-08-17T02:54:00Z">
+        <w:ins w:id="314" w:author="Gentry, Mark" w:date="2024-08-16T22:54:00Z" w16du:dateUtc="2024-08-17T02:54:00Z">
           <w:r>
             <w:rPr>
               <w:noProof/>
@@ -6874,19 +7134,27 @@
             <w:t>202408</w:t>
           </w:r>
         </w:ins>
-        <w:ins w:id="269" w:author="Gentry, Mark" w:date="2024-08-21T08:26:00Z" w16du:dateUtc="2024-08-21T12:26:00Z">
+        <w:ins w:id="315" w:author="Gentry, Mark" w:date="2024-08-21T08:26:00Z" w16du:dateUtc="2024-08-21T12:26:00Z">
           <w:r>
             <w:rPr>
               <w:noProof/>
             </w:rPr>
-            <w:t>21</w:t>
+            <w:t>2</w:t>
+          </w:r>
+        </w:ins>
+        <w:ins w:id="316" w:author="Gentry, Mark" w:date="2024-08-24T12:57:00Z" w16du:dateUtc="2024-08-24T16:57:00Z">
+          <w:r>
+            <w:rPr>
+              <w:noProof/>
+            </w:rPr>
+            <w:t>4</w:t>
           </w:r>
         </w:ins>
       </w:p>
-      <w:customXmlInsRangeStart w:id="270" w:author="Gentry, Mark" w:date="2024-08-16T22:53:00Z"/>
+      <w:customXmlInsRangeStart w:id="317" w:author="Gentry, Mark" w:date="2024-08-16T22:53:00Z"/>
     </w:sdtContent>
   </w:sdt>
-  <w:customXmlInsRangeEnd w:id="270"/>
+  <w:customXmlInsRangeEnd w:id="317"/>
   <w:p>
     <w:pPr>
       <w:pStyle w:val="Footer"/>
@@ -7011,8 +7279,8 @@
               <w:sz w:val="22"/>
             </w:rPr>
           </w:pPr>
-          <w:smartTag w:uri="urn:schemas-microsoft-com:office:smarttags" w:element="Street">
-            <w:smartTag w:uri="urn:schemas-microsoft-com:office:smarttags" w:element="address">
+          <w:smartTag w:uri="urn:schemas-microsoft-com:office:smarttags" w:element="address">
+            <w:smartTag w:uri="urn:schemas-microsoft-com:office:smarttags" w:element="Street">
               <w:r>
                 <w:rPr>
                   <w:rFonts w:ascii="Times New Roman" w:hAnsi="Times New Roman"/>

</xml_diff>